<commit_message>
docs(manuale): aggiorna esportazione DOCX per Microsoft Word con stili, intestazione, piè pagina e indice
</commit_message>
<xml_diff>
--- a/STUDIO_LEGALE_AI_MANUALE_IT.docx
+++ b/STUDIO_LEGALE_AI_MANUALE_IT.docx
@@ -651,7 +651,7 @@
                 <w:color w:val="333333"/>
                 <w:sz w:val="20"/>
               </w:rPr>
-              <w:t>PDF per la stampa, DOCX per le modifiche, MD per l’archivio</w:t>
+              <w:t>PDF per la stampa, DOCX per Microsoft Word, MD per l’archivio</w:t>
             </w:r>
           </w:p>
         </w:tc>
@@ -5856,7 +5856,232 @@
           <w:color w:val="333333"/>
           <w:sz w:val="22"/>
         </w:rPr>
-        <w:t>Il formato è professionale, con font Times New Roman 12pt</w:t>
+        <w:t>Il formato è professionale, con:</w:t>
+      </w:r>
+    </w:p>
+    <w:p>
+      <w:pPr>
+        <w:pStyle w:val="ListBullet"/>
+        <w:spacing w:line="360" w:lineRule="auto" w:after="80"/>
+        <w:ind w:left="567"/>
+      </w:pPr>
+      <w:r>
+        <w:rPr>
+          <w:rFonts w:ascii="Calibri" w:hAnsi="Calibri"/>
+          <w:color w:val="333333"/>
+          <w:sz w:val="22"/>
+        </w:rPr>
+        <w:t>Font Times New Roman 12pt</w:t>
+      </w:r>
+    </w:p>
+    <w:p>
+      <w:pPr>
+        <w:pStyle w:val="ListBullet"/>
+        <w:spacing w:line="360" w:lineRule="auto" w:after="80"/>
+        <w:ind w:left="567"/>
+      </w:pPr>
+      <w:r>
+        <w:rPr>
+          <w:rFonts w:ascii="Calibri" w:hAnsi="Calibri"/>
+          <w:color w:val="333333"/>
+          <w:sz w:val="22"/>
+        </w:rPr>
+        <w:t>Intestazione su ogni pagina con nome studio e avvocato</w:t>
+      </w:r>
+    </w:p>
+    <w:p>
+      <w:pPr>
+        <w:pStyle w:val="ListBullet"/>
+        <w:spacing w:line="360" w:lineRule="auto" w:after="80"/>
+        <w:ind w:left="567"/>
+      </w:pPr>
+      <w:r>
+        <w:rPr>
+          <w:rFonts w:ascii="Calibri" w:hAnsi="Calibri"/>
+          <w:color w:val="333333"/>
+          <w:sz w:val="22"/>
+        </w:rPr>
+        <w:t>Piè di pagina con tipologia documento, numero di protocollo (se presente) e numero pagina</w:t>
+      </w:r>
+    </w:p>
+    <w:p>
+      <w:pPr>
+        <w:pStyle w:val="ListBullet"/>
+        <w:spacing w:line="360" w:lineRule="auto" w:after="80"/>
+        <w:ind w:left="567"/>
+      </w:pPr>
+      <w:r>
+        <w:rPr>
+          <w:rFonts w:ascii="Calibri" w:hAnsi="Calibri"/>
+          <w:color w:val="333333"/>
+          <w:sz w:val="22"/>
+        </w:rPr>
+        <w:t>Stili Word nativi (Titolo 1, Titolo 2, Titolo 3, elenchi puntati/numerati)</w:t>
+      </w:r>
+    </w:p>
+    <w:p>
+      <w:pPr>
+        <w:pStyle w:val="ListBullet"/>
+        <w:spacing w:line="360" w:lineRule="auto" w:after="80"/>
+        <w:ind w:left="567"/>
+      </w:pPr>
+      <w:r>
+        <w:rPr>
+          <w:rFonts w:ascii="Calibri" w:hAnsi="Calibri"/>
+          <w:color w:val="333333"/>
+          <w:sz w:val="22"/>
+        </w:rPr>
+        <w:t>Indice automatico generato dagli heading del documento</w:t>
+      </w:r>
+    </w:p>
+    <w:p>
+      <w:pPr>
+        <w:pStyle w:val="ListBullet"/>
+        <w:spacing w:line="360" w:lineRule="auto" w:after="80"/>
+        <w:ind w:left="567"/>
+      </w:pPr>
+      <w:r>
+        <w:rPr>
+          <w:rFonts w:ascii="Calibri" w:hAnsi="Calibri"/>
+          <w:color w:val="333333"/>
+          <w:sz w:val="22"/>
+        </w:rPr>
+        <w:t>Tabelle formattate con intestazione in evidenza</w:t>
+      </w:r>
+    </w:p>
+    <w:p>
+      <w:pPr>
+        <w:pStyle w:val="ListBullet"/>
+        <w:spacing w:line="360" w:lineRule="auto" w:after="80"/>
+        <w:ind w:left="567"/>
+      </w:pPr>
+      <w:r>
+        <w:rPr>
+          <w:rFonts w:ascii="Calibri" w:hAnsi="Calibri"/>
+          <w:color w:val="333333"/>
+          <w:sz w:val="22"/>
+        </w:rPr>
+        <w:t>Firma in calce</w:t>
+      </w:r>
+    </w:p>
+    <w:p>
+      <w:pPr>
+        <w:pStyle w:val="ListBullet"/>
+        <w:spacing w:line="360" w:lineRule="auto" w:after="80"/>
+        <w:ind w:left="567"/>
+      </w:pPr>
+      <w:r>
+        <w:rPr>
+          <w:rFonts w:ascii="Calibri" w:hAnsi="Calibri"/>
+          <w:color w:val="333333"/>
+          <w:sz w:val="22"/>
+        </w:rPr>
+        <w:t>Metadati del documento (titolo, autore, oggetto)</w:t>
+      </w:r>
+    </w:p>
+    <w:p>
+      <w:pPr>
+        <w:pStyle w:val="Heading3"/>
+        <w:spacing w:before="240" w:after="120"/>
+      </w:pPr>
+      <w:r>
+        <w:rPr>
+          <w:rFonts w:ascii="Calibri" w:hAnsi="Calibri"/>
+          <w:b/>
+          <w:color w:val="1A3C6E"/>
+          <w:sz w:val="26"/>
+        </w:rPr>
+        <w:t>Flusso consigliato con Microsoft Word</w:t>
+      </w:r>
+    </w:p>
+    <w:p>
+      <w:pPr>
+        <w:pStyle w:val="ListNumber"/>
+        <w:spacing w:line="360" w:lineRule="auto" w:after="80"/>
+        <w:ind w:left="567"/>
+      </w:pPr>
+      <w:r>
+        <w:rPr>
+          <w:rFonts w:ascii="Calibri" w:hAnsi="Calibri"/>
+          <w:color w:val="333333"/>
+          <w:sz w:val="22"/>
+        </w:rPr>
+        <w:t>Genera il documento in Studio Legale AI</w:t>
+      </w:r>
+    </w:p>
+    <w:p>
+      <w:pPr>
+        <w:pStyle w:val="ListNumber"/>
+        <w:spacing w:line="360" w:lineRule="auto" w:after="80"/>
+        <w:ind w:left="567"/>
+      </w:pPr>
+      <w:r>
+        <w:rPr>
+          <w:rFonts w:ascii="Calibri" w:hAnsi="Calibri"/>
+          <w:color w:val="333333"/>
+          <w:sz w:val="22"/>
+        </w:rPr>
+        <w:t>Scarica la versione DOCX</w:t>
+      </w:r>
+    </w:p>
+    <w:p>
+      <w:pPr>
+        <w:pStyle w:val="ListNumber"/>
+        <w:spacing w:line="360" w:lineRule="auto" w:after="80"/>
+        <w:ind w:left="567"/>
+      </w:pPr>
+      <w:r>
+        <w:rPr>
+          <w:rFonts w:ascii="Calibri" w:hAnsi="Calibri"/>
+          <w:color w:val="333333"/>
+          <w:sz w:val="22"/>
+        </w:rPr>
+        <w:t>Apri il file in Word e apporta le modifiche necessarie</w:t>
+      </w:r>
+    </w:p>
+    <w:p>
+      <w:pPr>
+        <w:pStyle w:val="ListNumber"/>
+        <w:spacing w:line="360" w:lineRule="auto" w:after="80"/>
+        <w:ind w:left="567"/>
+      </w:pPr>
+      <w:r>
+        <w:rPr>
+          <w:rFonts w:ascii="Calibri" w:hAnsi="Calibri"/>
+          <w:color w:val="333333"/>
+          <w:sz w:val="22"/>
+        </w:rPr>
+        <w:t>Salva il file modificato</w:t>
+      </w:r>
+    </w:p>
+    <w:p>
+      <w:pPr>
+        <w:pStyle w:val="ListNumber"/>
+        <w:spacing w:line="360" w:lineRule="auto" w:after="80"/>
+        <w:ind w:left="567"/>
+      </w:pPr>
+      <w:r>
+        <w:rPr>
+          <w:rFonts w:ascii="Calibri" w:hAnsi="Calibri"/>
+          <w:color w:val="333333"/>
+          <w:sz w:val="22"/>
+        </w:rPr>
+        <w:t>Se vuoi archiviare la versione finale nello studio, caricala tramite I miei Documenti oppure allegala a una nuova email dal sistema</w:t>
+      </w:r>
+    </w:p>
+    <w:p>
+      <w:pPr>
+        <w:spacing w:before="120" w:after="120"/>
+        <w:ind w:left="567" w:right="567"/>
+      </w:pPr>
+      <w:r>
+        <w:rPr>
+          <w:rFonts w:ascii="Calibri" w:hAnsi="Calibri"/>
+          <w:i/>
+          <w:color w:val="555555"/>
+          <w:sz w:val="22"/>
+        </w:rPr>
+        <w:t>**Suggerimento:** Word riconosce automaticamente gli stili applicati, quindi puoi aggiornare l'indice con un clic su &lt;strong&gt;Riferimenti → Aggiorna indice&lt;/strong&gt;.</w:t>
       </w:r>
     </w:p>
     <w:p>

</xml_diff>

<commit_message>
docs: aggiunge piano PEC/e-filing, sezioni manuale PEC/deposito telematico e aggiorna valutazione concorrenza
</commit_message>
<xml_diff>
--- a/STUDIO_LEGALE_AI_MANUALE_IT.docx
+++ b/STUDIO_LEGALE_AI_MANUALE_IT.docx
@@ -10297,6 +10297,1380 @@
           <w:sz w:val="22"/>
         </w:rPr>
         <w:t>**Sicurezza:** le credenziali dei gestionali sono salvate solo sul tuo computer, nel file `database/settings.json`, e non vengono mai trasmesse a GeneForge o a terzi.</w:t>
+      </w:r>
+    </w:p>
+    <w:p>
+      <w:pPr>
+        <w:pStyle w:val="Heading2"/>
+        <w:spacing w:before="360" w:after="160"/>
+      </w:pPr>
+      <w:r>
+        <w:rPr>
+          <w:rFonts w:ascii="Calibri" w:hAnsi="Calibri"/>
+          <w:b/>
+          <w:color w:val="1A3C6E"/>
+          <w:sz w:val="32"/>
+        </w:rPr>
+        <w:t>📧 PEC Professionale</w:t>
+      </w:r>
+    </w:p>
+    <w:p>
+      <w:pPr>
+        <w:spacing w:line="360" w:lineRule="auto" w:after="120"/>
+      </w:pPr>
+      <w:r>
+        <w:rPr>
+          <w:rFonts w:ascii="Calibri" w:hAnsi="Calibri"/>
+          <w:color w:val="333333"/>
+          <w:sz w:val="22"/>
+        </w:rPr>
+        <w:t>Studio Legale AI integra la Posta Elettronica Certificata per inviare e ricevere comunicazioni legali direttamente dalla piattaforma. Le credenziali PEC restano salvate solo in locale.</w:t>
+      </w:r>
+    </w:p>
+    <w:p>
+      <w:pPr>
+        <w:spacing w:line="360" w:lineRule="auto" w:after="120"/>
+      </w:pPr>
+      <w:r>
+        <w:rPr>
+          <w:rFonts w:ascii="Calibri" w:hAnsi="Calibri"/>
+          <w:color w:val="333333"/>
+          <w:sz w:val="22"/>
+        </w:rPr>
+        <w:t>Provider supportati:</w:t>
+      </w:r>
+    </w:p>
+    <w:tbl>
+      <w:tblPr>
+        <w:tblStyle w:val="TableGrid"/>
+        <w:tblW w:type="auto" w:w="0"/>
+        <w:tblLayout w:type="autofit"/>
+        <w:tblLook w:firstColumn="1" w:firstRow="1" w:lastColumn="0" w:lastRow="0" w:noHBand="0" w:noVBand="1" w:val="04A0"/>
+      </w:tblPr>
+      <w:tblGrid>
+        <w:gridCol w:w="3135"/>
+        <w:gridCol w:w="3135"/>
+        <w:gridCol w:w="3135"/>
+      </w:tblGrid>
+      <w:tr>
+        <w:tc>
+          <w:tcPr>
+            <w:tcW w:type="dxa" w:w="3135"/>
+            <w:shd w:fill="1A3C6E"/>
+          </w:tcPr>
+          <w:p>
+            <w:pPr>
+              <w:jc w:val="center"/>
+            </w:pPr>
+            <w:r>
+              <w:rPr>
+                <w:rFonts w:ascii="Calibri" w:hAnsi="Calibri"/>
+                <w:b/>
+                <w:color w:val="FFFFFF"/>
+                <w:sz w:val="20"/>
+              </w:rPr>
+              <w:t>Provider</w:t>
+            </w:r>
+          </w:p>
+        </w:tc>
+        <w:tc>
+          <w:tcPr>
+            <w:tcW w:type="dxa" w:w="3135"/>
+            <w:shd w:fill="1A3C6E"/>
+          </w:tcPr>
+          <w:p>
+            <w:pPr>
+              <w:jc w:val="center"/>
+            </w:pPr>
+            <w:r>
+              <w:rPr>
+                <w:rFonts w:ascii="Calibri" w:hAnsi="Calibri"/>
+                <w:b/>
+                <w:color w:val="FFFFFF"/>
+                <w:sz w:val="20"/>
+              </w:rPr>
+              <w:t>Server predefinito</w:t>
+            </w:r>
+          </w:p>
+        </w:tc>
+        <w:tc>
+          <w:tcPr>
+            <w:tcW w:type="dxa" w:w="3135"/>
+            <w:shd w:fill="1A3C6E"/>
+          </w:tcPr>
+          <w:p>
+            <w:pPr>
+              <w:jc w:val="center"/>
+            </w:pPr>
+            <w:r>
+              <w:rPr>
+                <w:rFonts w:ascii="Calibri" w:hAnsi="Calibri"/>
+                <w:b/>
+                <w:color w:val="FFFFFF"/>
+                <w:sz w:val="20"/>
+              </w:rPr>
+              <w:t>Protocollo</w:t>
+            </w:r>
+          </w:p>
+        </w:tc>
+      </w:tr>
+      <w:tr>
+        <w:tc>
+          <w:tcPr>
+            <w:tcW w:type="dxa" w:w="3135"/>
+          </w:tcPr>
+          <w:p>
+            <w:r>
+              <w:rPr>
+                <w:rFonts w:ascii="Calibri" w:hAnsi="Calibri"/>
+                <w:color w:val="333333"/>
+                <w:sz w:val="20"/>
+              </w:rPr>
+              <w:t>**Aruba PEC**</w:t>
+            </w:r>
+          </w:p>
+        </w:tc>
+        <w:tc>
+          <w:tcPr>
+            <w:tcW w:type="dxa" w:w="3135"/>
+          </w:tcPr>
+          <w:p>
+            <w:r>
+              <w:rPr>
+                <w:rFonts w:ascii="Calibri" w:hAnsi="Calibri"/>
+                <w:color w:val="333333"/>
+                <w:sz w:val="20"/>
+              </w:rPr>
+              <w:t>`smtp.pec.aruba.it` / `imap.pec.aruba.it`</w:t>
+            </w:r>
+          </w:p>
+        </w:tc>
+        <w:tc>
+          <w:tcPr>
+            <w:tcW w:type="dxa" w:w="3135"/>
+          </w:tcPr>
+          <w:p>
+            <w:r>
+              <w:rPr>
+                <w:rFonts w:ascii="Calibri" w:hAnsi="Calibri"/>
+                <w:color w:val="333333"/>
+                <w:sz w:val="20"/>
+              </w:rPr>
+              <w:t>SMTP/IMAP SSL</w:t>
+            </w:r>
+          </w:p>
+        </w:tc>
+      </w:tr>
+      <w:tr>
+        <w:tc>
+          <w:tcPr>
+            <w:tcW w:type="dxa" w:w="3135"/>
+          </w:tcPr>
+          <w:p>
+            <w:r>
+              <w:rPr>
+                <w:rFonts w:ascii="Calibri" w:hAnsi="Calibri"/>
+                <w:color w:val="333333"/>
+                <w:sz w:val="20"/>
+              </w:rPr>
+              <w:t>**Legalmail**</w:t>
+            </w:r>
+          </w:p>
+        </w:tc>
+        <w:tc>
+          <w:tcPr>
+            <w:tcW w:type="dxa" w:w="3135"/>
+          </w:tcPr>
+          <w:p>
+            <w:r>
+              <w:rPr>
+                <w:rFonts w:ascii="Calibri" w:hAnsi="Calibri"/>
+                <w:color w:val="333333"/>
+                <w:sz w:val="20"/>
+              </w:rPr>
+              <w:t>`smtp.legalmail.it` / `imap.legalmail.it`</w:t>
+            </w:r>
+          </w:p>
+        </w:tc>
+        <w:tc>
+          <w:tcPr>
+            <w:tcW w:type="dxa" w:w="3135"/>
+          </w:tcPr>
+          <w:p>
+            <w:r>
+              <w:rPr>
+                <w:rFonts w:ascii="Calibri" w:hAnsi="Calibri"/>
+                <w:color w:val="333333"/>
+                <w:sz w:val="20"/>
+              </w:rPr>
+              <w:t>SMTP/IMAP SSL</w:t>
+            </w:r>
+          </w:p>
+        </w:tc>
+      </w:tr>
+      <w:tr>
+        <w:tc>
+          <w:tcPr>
+            <w:tcW w:type="dxa" w:w="3135"/>
+          </w:tcPr>
+          <w:p>
+            <w:r>
+              <w:rPr>
+                <w:rFonts w:ascii="Calibri" w:hAnsi="Calibri"/>
+                <w:color w:val="333333"/>
+                <w:sz w:val="20"/>
+              </w:rPr>
+              <w:t>**PosteCert**</w:t>
+            </w:r>
+          </w:p>
+        </w:tc>
+        <w:tc>
+          <w:tcPr>
+            <w:tcW w:type="dxa" w:w="3135"/>
+          </w:tcPr>
+          <w:p>
+            <w:r>
+              <w:rPr>
+                <w:rFonts w:ascii="Calibri" w:hAnsi="Calibri"/>
+                <w:color w:val="333333"/>
+                <w:sz w:val="20"/>
+              </w:rPr>
+              <w:t>`smtp.postecert.it` / `imap.postecert.it`</w:t>
+            </w:r>
+          </w:p>
+        </w:tc>
+        <w:tc>
+          <w:tcPr>
+            <w:tcW w:type="dxa" w:w="3135"/>
+          </w:tcPr>
+          <w:p>
+            <w:r>
+              <w:rPr>
+                <w:rFonts w:ascii="Calibri" w:hAnsi="Calibri"/>
+                <w:color w:val="333333"/>
+                <w:sz w:val="20"/>
+              </w:rPr>
+              <w:t>SMTP/IMAP SSL</w:t>
+            </w:r>
+          </w:p>
+        </w:tc>
+      </w:tr>
+      <w:tr>
+        <w:tc>
+          <w:tcPr>
+            <w:tcW w:type="dxa" w:w="3135"/>
+          </w:tcPr>
+          <w:p>
+            <w:r>
+              <w:rPr>
+                <w:rFonts w:ascii="Calibri" w:hAnsi="Calibri"/>
+                <w:color w:val="333333"/>
+                <w:sz w:val="20"/>
+              </w:rPr>
+              <w:t>**PEC.it**</w:t>
+            </w:r>
+          </w:p>
+        </w:tc>
+        <w:tc>
+          <w:tcPr>
+            <w:tcW w:type="dxa" w:w="3135"/>
+          </w:tcPr>
+          <w:p>
+            <w:r>
+              <w:rPr>
+                <w:rFonts w:ascii="Calibri" w:hAnsi="Calibri"/>
+                <w:color w:val="333333"/>
+                <w:sz w:val="20"/>
+              </w:rPr>
+              <w:t>`smtp.pec.it` / `imap.pec.it`</w:t>
+            </w:r>
+          </w:p>
+        </w:tc>
+        <w:tc>
+          <w:tcPr>
+            <w:tcW w:type="dxa" w:w="3135"/>
+          </w:tcPr>
+          <w:p>
+            <w:r>
+              <w:rPr>
+                <w:rFonts w:ascii="Calibri" w:hAnsi="Calibri"/>
+                <w:color w:val="333333"/>
+                <w:sz w:val="20"/>
+              </w:rPr>
+              <w:t>SMTP/IMAP SSL</w:t>
+            </w:r>
+          </w:p>
+        </w:tc>
+      </w:tr>
+      <w:tr>
+        <w:tc>
+          <w:tcPr>
+            <w:tcW w:type="dxa" w:w="3135"/>
+          </w:tcPr>
+          <w:p>
+            <w:r>
+              <w:rPr>
+                <w:rFonts w:ascii="Calibri" w:hAnsi="Calibri"/>
+                <w:color w:val="333333"/>
+                <w:sz w:val="20"/>
+              </w:rPr>
+              <w:t>**Provider generico**</w:t>
+            </w:r>
+          </w:p>
+        </w:tc>
+        <w:tc>
+          <w:tcPr>
+            <w:tcW w:type="dxa" w:w="3135"/>
+          </w:tcPr>
+          <w:p>
+            <w:r>
+              <w:rPr>
+                <w:rFonts w:ascii="Calibri" w:hAnsi="Calibri"/>
+                <w:color w:val="333333"/>
+                <w:sz w:val="20"/>
+              </w:rPr>
+              <w:t>Personalizzabile</w:t>
+            </w:r>
+          </w:p>
+        </w:tc>
+        <w:tc>
+          <w:tcPr>
+            <w:tcW w:type="dxa" w:w="3135"/>
+          </w:tcPr>
+          <w:p>
+            <w:r>
+              <w:rPr>
+                <w:rFonts w:ascii="Calibri" w:hAnsi="Calibri"/>
+                <w:color w:val="333333"/>
+                <w:sz w:val="20"/>
+              </w:rPr>
+              <w:t>SMTP/IMAP SSL/TLS</w:t>
+            </w:r>
+          </w:p>
+        </w:tc>
+      </w:tr>
+    </w:tbl>
+    <w:p/>
+    <w:p>
+      <w:pPr>
+        <w:pStyle w:val="Heading3"/>
+        <w:spacing w:before="240" w:after="120"/>
+      </w:pPr>
+      <w:r>
+        <w:rPr>
+          <w:rFonts w:ascii="Calibri" w:hAnsi="Calibri"/>
+          <w:b/>
+          <w:color w:val="1A3C6E"/>
+          <w:sz w:val="26"/>
+        </w:rPr>
+        <w:t>Funzionalità</w:t>
+      </w:r>
+    </w:p>
+    <w:p>
+      <w:pPr>
+        <w:pStyle w:val="ListBullet"/>
+        <w:spacing w:line="360" w:lineRule="auto" w:after="80"/>
+        <w:ind w:left="567"/>
+      </w:pPr>
+      <w:r>
+        <w:rPr>
+          <w:rFonts w:ascii="Calibri" w:hAnsi="Calibri"/>
+          <w:color w:val="333333"/>
+          <w:sz w:val="22"/>
+        </w:rPr>
+        <w:t>Invio PEC con destinatario, oggetto, corpo e allegati (PDF/DOCX).</w:t>
+      </w:r>
+    </w:p>
+    <w:p>
+      <w:pPr>
+        <w:pStyle w:val="ListBullet"/>
+        <w:spacing w:line="360" w:lineRule="auto" w:after="80"/>
+        <w:ind w:left="567"/>
+      </w:pPr>
+      <w:r>
+        <w:rPr>
+          <w:rFonts w:ascii="Calibri" w:hAnsi="Calibri"/>
+          <w:color w:val="333333"/>
+          <w:sz w:val="22"/>
+        </w:rPr>
+        <w:t>Ricezione PEC tramite IMAP con riconoscimento ricevute di accettazione/consegna.</w:t>
+      </w:r>
+    </w:p>
+    <w:p>
+      <w:pPr>
+        <w:pStyle w:val="ListBullet"/>
+        <w:spacing w:line="360" w:lineRule="auto" w:after="80"/>
+        <w:ind w:left="567"/>
+      </w:pPr>
+      <w:r>
+        <w:rPr>
+          <w:rFonts w:ascii="Calibri" w:hAnsi="Calibri"/>
+          <w:color w:val="333333"/>
+          <w:sz w:val="22"/>
+        </w:rPr>
+        <w:t>Associazione automatica alla pratica tramite numero pratica nell'oggetto.</w:t>
+      </w:r>
+    </w:p>
+    <w:p>
+      <w:pPr>
+        <w:pStyle w:val="ListBullet"/>
+        <w:spacing w:line="360" w:lineRule="auto" w:after="80"/>
+        <w:ind w:left="567"/>
+      </w:pPr>
+      <w:r>
+        <w:rPr>
+          <w:rFonts w:ascii="Calibri" w:hAnsi="Calibri"/>
+          <w:color w:val="333333"/>
+          <w:sz w:val="22"/>
+        </w:rPr>
+        <w:t>Archivio locale dei messaggi in ingresso e in uscita.</w:t>
+      </w:r>
+    </w:p>
+    <w:p>
+      <w:pPr>
+        <w:pStyle w:val="Heading3"/>
+        <w:spacing w:before="240" w:after="120"/>
+      </w:pPr>
+      <w:r>
+        <w:rPr>
+          <w:rFonts w:ascii="Calibri" w:hAnsi="Calibri"/>
+          <w:b/>
+          <w:color w:val="1A3C6E"/>
+          <w:sz w:val="26"/>
+        </w:rPr>
+        <w:t>Come configurare la PEC</w:t>
+      </w:r>
+    </w:p>
+    <w:p>
+      <w:pPr>
+        <w:pStyle w:val="ListNumber"/>
+        <w:spacing w:line="360" w:lineRule="auto" w:after="80"/>
+        <w:ind w:left="567"/>
+      </w:pPr>
+      <w:r>
+        <w:rPr>
+          <w:rFonts w:ascii="Calibri" w:hAnsi="Calibri"/>
+          <w:color w:val="333333"/>
+          <w:sz w:val="22"/>
+        </w:rPr>
+        <w:t>Vai su Impostazioni</w:t>
+      </w:r>
+    </w:p>
+    <w:p>
+      <w:pPr>
+        <w:pStyle w:val="ListNumber"/>
+        <w:spacing w:line="360" w:lineRule="auto" w:after="80"/>
+        <w:ind w:left="567"/>
+      </w:pPr>
+      <w:r>
+        <w:rPr>
+          <w:rFonts w:ascii="Calibri" w:hAnsi="Calibri"/>
+          <w:color w:val="333333"/>
+          <w:sz w:val="22"/>
+        </w:rPr>
+        <w:t>Scorri fino alla sezione 📧 PEC Professionale</w:t>
+      </w:r>
+    </w:p>
+    <w:p>
+      <w:pPr>
+        <w:pStyle w:val="ListNumber"/>
+        <w:spacing w:line="360" w:lineRule="auto" w:after="80"/>
+        <w:ind w:left="567"/>
+      </w:pPr>
+      <w:r>
+        <w:rPr>
+          <w:rFonts w:ascii="Calibri" w:hAnsi="Calibri"/>
+          <w:color w:val="333333"/>
+          <w:sz w:val="22"/>
+        </w:rPr>
+        <w:t>Seleziona il provider o inserisci i server manualmente</w:t>
+      </w:r>
+    </w:p>
+    <w:p>
+      <w:pPr>
+        <w:pStyle w:val="ListNumber"/>
+        <w:spacing w:line="360" w:lineRule="auto" w:after="80"/>
+        <w:ind w:left="567"/>
+      </w:pPr>
+      <w:r>
+        <w:rPr>
+          <w:rFonts w:ascii="Calibri" w:hAnsi="Calibri"/>
+          <w:color w:val="333333"/>
+          <w:sz w:val="22"/>
+        </w:rPr>
+        <w:t>Inserisci:</w:t>
+      </w:r>
+    </w:p>
+    <w:p>
+      <w:pPr>
+        <w:pStyle w:val="ListBullet"/>
+        <w:spacing w:line="360" w:lineRule="auto" w:after="80"/>
+        <w:ind w:left="567"/>
+      </w:pPr>
+      <w:r>
+        <w:rPr>
+          <w:rFonts w:ascii="Calibri" w:hAnsi="Calibri"/>
+          <w:color w:val="333333"/>
+          <w:sz w:val="22"/>
+        </w:rPr>
+        <w:t>Indirizzo PEC</w:t>
+      </w:r>
+    </w:p>
+    <w:p>
+      <w:pPr>
+        <w:pStyle w:val="ListBullet"/>
+        <w:spacing w:line="360" w:lineRule="auto" w:after="80"/>
+        <w:ind w:left="567"/>
+      </w:pPr>
+      <w:r>
+        <w:rPr>
+          <w:rFonts w:ascii="Calibri" w:hAnsi="Calibri"/>
+          <w:color w:val="333333"/>
+          <w:sz w:val="22"/>
+        </w:rPr>
+        <w:t>Username</w:t>
+      </w:r>
+    </w:p>
+    <w:p>
+      <w:pPr>
+        <w:pStyle w:val="ListBullet"/>
+        <w:spacing w:line="360" w:lineRule="auto" w:after="80"/>
+        <w:ind w:left="567"/>
+      </w:pPr>
+      <w:r>
+        <w:rPr>
+          <w:rFonts w:ascii="Calibri" w:hAnsi="Calibri"/>
+          <w:color w:val="333333"/>
+          <w:sz w:val="22"/>
+        </w:rPr>
+        <w:t>Password</w:t>
+      </w:r>
+    </w:p>
+    <w:p>
+      <w:pPr>
+        <w:pStyle w:val="ListBullet"/>
+        <w:spacing w:line="360" w:lineRule="auto" w:after="80"/>
+        <w:ind w:left="567"/>
+      </w:pPr>
+      <w:r>
+        <w:rPr>
+          <w:rFonts w:ascii="Calibri" w:hAnsi="Calibri"/>
+          <w:color w:val="333333"/>
+          <w:sz w:val="22"/>
+        </w:rPr>
+        <w:t>Server SMTP/IMAP e relative porte</w:t>
+      </w:r>
+    </w:p>
+    <w:p>
+      <w:pPr>
+        <w:pStyle w:val="ListNumber"/>
+        <w:spacing w:line="360" w:lineRule="auto" w:after="80"/>
+        <w:ind w:left="567"/>
+      </w:pPr>
+      <w:r>
+        <w:rPr>
+          <w:rFonts w:ascii="Calibri" w:hAnsi="Calibri"/>
+          <w:color w:val="333333"/>
+          <w:sz w:val="22"/>
+        </w:rPr>
+        <w:t>Clicca 💾 Salva</w:t>
+      </w:r>
+    </w:p>
+    <w:p>
+      <w:pPr>
+        <w:pStyle w:val="ListNumber"/>
+        <w:spacing w:line="360" w:lineRule="auto" w:after="80"/>
+        <w:ind w:left="567"/>
+      </w:pPr>
+      <w:r>
+        <w:rPr>
+          <w:rFonts w:ascii="Calibri" w:hAnsi="Calibri"/>
+          <w:color w:val="333333"/>
+          <w:sz w:val="22"/>
+        </w:rPr>
+        <w:t>Clicca 🧪 Test PEC per verificare la connessione</w:t>
+      </w:r>
+    </w:p>
+    <w:p>
+      <w:pPr>
+        <w:spacing w:before="120" w:after="120"/>
+        <w:ind w:left="567" w:right="567"/>
+      </w:pPr>
+      <w:r>
+        <w:rPr>
+          <w:rFonts w:ascii="Calibri" w:hAnsi="Calibri"/>
+          <w:i/>
+          <w:color w:val="555555"/>
+          <w:sz w:val="22"/>
+        </w:rPr>
+        <w:t>**Importante:** per l'invio effettivo è necessario che il provider PEC abiliti l'accesso SMTP. Alcuni provider richiedono password specifiche per applicazioni o l'abilitazione dell'accesso meno sicuro.</w:t>
+      </w:r>
+    </w:p>
+    <w:p>
+      <w:pPr>
+        <w:pStyle w:val="Heading2"/>
+        <w:spacing w:before="360" w:after="160"/>
+      </w:pPr>
+      <w:r>
+        <w:rPr>
+          <w:rFonts w:ascii="Calibri" w:hAnsi="Calibri"/>
+          <w:b/>
+          <w:color w:val="1A3C6E"/>
+          <w:sz w:val="32"/>
+        </w:rPr>
+        <w:t>⚖️ Deposito Telematico / E-filing</w:t>
+      </w:r>
+    </w:p>
+    <w:p>
+      <w:pPr>
+        <w:spacing w:line="360" w:lineRule="auto" w:after="120"/>
+      </w:pPr>
+      <w:r>
+        <w:rPr>
+          <w:rFonts w:ascii="Calibri" w:hAnsi="Calibri"/>
+          <w:color w:val="333333"/>
+          <w:sz w:val="22"/>
+        </w:rPr>
+        <w:t>Studio Legale AI predispone i connettori per i principali portali di deposito telematico italiani. L'integrazione automatica richiede firma digitale/smart card e/o API del provider; il sistema genera il pacchetto di deposito e apre il link al portale corretto.</w:t>
+      </w:r>
+    </w:p>
+    <w:p>
+      <w:pPr>
+        <w:spacing w:line="360" w:lineRule="auto" w:after="120"/>
+      </w:pPr>
+      <w:r>
+        <w:rPr>
+          <w:rFonts w:ascii="Calibri" w:hAnsi="Calibri"/>
+          <w:color w:val="333333"/>
+          <w:sz w:val="22"/>
+        </w:rPr>
+        <w:t>Provider e portali supportati:</w:t>
+      </w:r>
+    </w:p>
+    <w:tbl>
+      <w:tblPr>
+        <w:tblStyle w:val="TableGrid"/>
+        <w:tblW w:type="auto" w:w="0"/>
+        <w:tblLayout w:type="autofit"/>
+        <w:tblLook w:firstColumn="1" w:firstRow="1" w:lastColumn="0" w:lastRow="0" w:noHBand="0" w:noVBand="1" w:val="04A0"/>
+      </w:tblPr>
+      <w:tblGrid>
+        <w:gridCol w:w="2351"/>
+        <w:gridCol w:w="2351"/>
+        <w:gridCol w:w="2351"/>
+        <w:gridCol w:w="2351"/>
+      </w:tblGrid>
+      <w:tr>
+        <w:tc>
+          <w:tcPr>
+            <w:tcW w:type="dxa" w:w="2351"/>
+            <w:shd w:fill="1A3C6E"/>
+          </w:tcPr>
+          <w:p>
+            <w:pPr>
+              <w:jc w:val="center"/>
+            </w:pPr>
+            <w:r>
+              <w:rPr>
+                <w:rFonts w:ascii="Calibri" w:hAnsi="Calibri"/>
+                <w:b/>
+                <w:color w:val="FFFFFF"/>
+                <w:sz w:val="20"/>
+              </w:rPr>
+              <w:t>Provider / Portale</w:t>
+            </w:r>
+          </w:p>
+        </w:tc>
+        <w:tc>
+          <w:tcPr>
+            <w:tcW w:type="dxa" w:w="2351"/>
+            <w:shd w:fill="1A3C6E"/>
+          </w:tcPr>
+          <w:p>
+            <w:pPr>
+              <w:jc w:val="center"/>
+            </w:pPr>
+            <w:r>
+              <w:rPr>
+                <w:rFonts w:ascii="Calibri" w:hAnsi="Calibri"/>
+                <w:b/>
+                <w:color w:val="FFFFFF"/>
+                <w:sz w:val="20"/>
+              </w:rPr>
+              <w:t>Categoria</w:t>
+            </w:r>
+          </w:p>
+        </w:tc>
+        <w:tc>
+          <w:tcPr>
+            <w:tcW w:type="dxa" w:w="2351"/>
+            <w:shd w:fill="1A3C6E"/>
+          </w:tcPr>
+          <w:p>
+            <w:pPr>
+              <w:jc w:val="center"/>
+            </w:pPr>
+            <w:r>
+              <w:rPr>
+                <w:rFonts w:ascii="Calibri" w:hAnsi="Calibri"/>
+                <w:b/>
+                <w:color w:val="FFFFFF"/>
+                <w:sz w:val="20"/>
+              </w:rPr>
+              <w:t>Requisiti</w:t>
+            </w:r>
+          </w:p>
+        </w:tc>
+        <w:tc>
+          <w:tcPr>
+            <w:tcW w:type="dxa" w:w="2351"/>
+            <w:shd w:fill="1A3C6E"/>
+          </w:tcPr>
+          <w:p>
+            <w:pPr>
+              <w:jc w:val="center"/>
+            </w:pPr>
+            <w:r>
+              <w:rPr>
+                <w:rFonts w:ascii="Calibri" w:hAnsi="Calibri"/>
+                <w:b/>
+                <w:color w:val="FFFFFF"/>
+                <w:sz w:val="20"/>
+              </w:rPr>
+              <w:t>Stato</w:t>
+            </w:r>
+          </w:p>
+        </w:tc>
+      </w:tr>
+      <w:tr>
+        <w:tc>
+          <w:tcPr>
+            <w:tcW w:type="dxa" w:w="2351"/>
+          </w:tcPr>
+          <w:p>
+            <w:r>
+              <w:rPr>
+                <w:rFonts w:ascii="Calibri" w:hAnsi="Calibri"/>
+                <w:color w:val="333333"/>
+                <w:sz w:val="20"/>
+              </w:rPr>
+              <w:t>**PCT** — Processo Civile Telematico</w:t>
+            </w:r>
+          </w:p>
+        </w:tc>
+        <w:tc>
+          <w:tcPr>
+            <w:tcW w:type="dxa" w:w="2351"/>
+          </w:tcPr>
+          <w:p>
+            <w:r>
+              <w:rPr>
+                <w:rFonts w:ascii="Calibri" w:hAnsi="Calibri"/>
+                <w:color w:val="333333"/>
+                <w:sz w:val="20"/>
+              </w:rPr>
+              <w:t>Ministero Giustizia</w:t>
+            </w:r>
+          </w:p>
+        </w:tc>
+        <w:tc>
+          <w:tcPr>
+            <w:tcW w:type="dxa" w:w="2351"/>
+          </w:tcPr>
+          <w:p>
+            <w:r>
+              <w:rPr>
+                <w:rFonts w:ascii="Calibri" w:hAnsi="Calibri"/>
+                <w:color w:val="333333"/>
+                <w:sz w:val="20"/>
+              </w:rPr>
+              <w:t>Smart card, software PCT, PIN</w:t>
+            </w:r>
+          </w:p>
+        </w:tc>
+        <w:tc>
+          <w:tcPr>
+            <w:tcW w:type="dxa" w:w="2351"/>
+          </w:tcPr>
+          <w:p>
+            <w:r>
+              <w:rPr>
+                <w:rFonts w:ascii="Calibri" w:hAnsi="Calibri"/>
+                <w:color w:val="333333"/>
+                <w:sz w:val="20"/>
+              </w:rPr>
+              <w:t>🟡 Placeholder</w:t>
+            </w:r>
+          </w:p>
+        </w:tc>
+      </w:tr>
+      <w:tr>
+        <w:tc>
+          <w:tcPr>
+            <w:tcW w:type="dxa" w:w="2351"/>
+          </w:tcPr>
+          <w:p>
+            <w:r>
+              <w:rPr>
+                <w:rFonts w:ascii="Calibri" w:hAnsi="Calibri"/>
+                <w:color w:val="333333"/>
+                <w:sz w:val="20"/>
+              </w:rPr>
+              <w:t>**UNEP** — Cassazione / Consiglio di Stato / TAR</w:t>
+            </w:r>
+          </w:p>
+        </w:tc>
+        <w:tc>
+          <w:tcPr>
+            <w:tcW w:type="dxa" w:w="2351"/>
+          </w:tcPr>
+          <w:p>
+            <w:r>
+              <w:rPr>
+                <w:rFonts w:ascii="Calibri" w:hAnsi="Calibri"/>
+                <w:color w:val="333333"/>
+                <w:sz w:val="20"/>
+              </w:rPr>
+              <w:t>Giurisdizioni superiori</w:t>
+            </w:r>
+          </w:p>
+        </w:tc>
+        <w:tc>
+          <w:tcPr>
+            <w:tcW w:type="dxa" w:w="2351"/>
+          </w:tcPr>
+          <w:p>
+            <w:r>
+              <w:rPr>
+                <w:rFonts w:ascii="Calibri" w:hAnsi="Calibri"/>
+                <w:color w:val="333333"/>
+                <w:sz w:val="20"/>
+              </w:rPr>
+              <w:t>Credenziali UNEP, smart card, PIN</w:t>
+            </w:r>
+          </w:p>
+        </w:tc>
+        <w:tc>
+          <w:tcPr>
+            <w:tcW w:type="dxa" w:w="2351"/>
+          </w:tcPr>
+          <w:p>
+            <w:r>
+              <w:rPr>
+                <w:rFonts w:ascii="Calibri" w:hAnsi="Calibri"/>
+                <w:color w:val="333333"/>
+                <w:sz w:val="20"/>
+              </w:rPr>
+              <w:t>🟡 Placeholder</w:t>
+            </w:r>
+          </w:p>
+        </w:tc>
+      </w:tr>
+      <w:tr>
+        <w:tc>
+          <w:tcPr>
+            <w:tcW w:type="dxa" w:w="2351"/>
+          </w:tcPr>
+          <w:p>
+            <w:r>
+              <w:rPr>
+                <w:rFonts w:ascii="Calibri" w:hAnsi="Calibri"/>
+                <w:color w:val="333333"/>
+                <w:sz w:val="20"/>
+              </w:rPr>
+              <w:t>**ReGIndE**</w:t>
+            </w:r>
+          </w:p>
+        </w:tc>
+        <w:tc>
+          <w:tcPr>
+            <w:tcW w:type="dxa" w:w="2351"/>
+          </w:tcPr>
+          <w:p>
+            <w:r>
+              <w:rPr>
+                <w:rFonts w:ascii="Calibri" w:hAnsi="Calibri"/>
+                <w:color w:val="333333"/>
+                <w:sz w:val="20"/>
+              </w:rPr>
+              <w:t>Registro indice elettronico</w:t>
+            </w:r>
+          </w:p>
+        </w:tc>
+        <w:tc>
+          <w:tcPr>
+            <w:tcW w:type="dxa" w:w="2351"/>
+          </w:tcPr>
+          <w:p>
+            <w:r>
+              <w:rPr>
+                <w:rFonts w:ascii="Calibri" w:hAnsi="Calibri"/>
+                <w:color w:val="333333"/>
+                <w:sz w:val="20"/>
+              </w:rPr>
+              <w:t>Credenziali, smart card</w:t>
+            </w:r>
+          </w:p>
+        </w:tc>
+        <w:tc>
+          <w:tcPr>
+            <w:tcW w:type="dxa" w:w="2351"/>
+          </w:tcPr>
+          <w:p>
+            <w:r>
+              <w:rPr>
+                <w:rFonts w:ascii="Calibri" w:hAnsi="Calibri"/>
+                <w:color w:val="333333"/>
+                <w:sz w:val="20"/>
+              </w:rPr>
+              <w:t>🟡 Placeholder</w:t>
+            </w:r>
+          </w:p>
+        </w:tc>
+      </w:tr>
+      <w:tr>
+        <w:tc>
+          <w:tcPr>
+            <w:tcW w:type="dxa" w:w="2351"/>
+          </w:tcPr>
+          <w:p>
+            <w:r>
+              <w:rPr>
+                <w:rFonts w:ascii="Calibri" w:hAnsi="Calibri"/>
+                <w:color w:val="333333"/>
+                <w:sz w:val="20"/>
+              </w:rPr>
+              <w:t>**Polisweb**</w:t>
+            </w:r>
+          </w:p>
+        </w:tc>
+        <w:tc>
+          <w:tcPr>
+            <w:tcW w:type="dxa" w:w="2351"/>
+          </w:tcPr>
+          <w:p>
+            <w:r>
+              <w:rPr>
+                <w:rFonts w:ascii="Calibri" w:hAnsi="Calibri"/>
+                <w:color w:val="333333"/>
+                <w:sz w:val="20"/>
+              </w:rPr>
+              <w:t>Commerciale</w:t>
+            </w:r>
+          </w:p>
+        </w:tc>
+        <w:tc>
+          <w:tcPr>
+            <w:tcW w:type="dxa" w:w="2351"/>
+          </w:tcPr>
+          <w:p>
+            <w:r>
+              <w:rPr>
+                <w:rFonts w:ascii="Calibri" w:hAnsi="Calibri"/>
+                <w:color w:val="333333"/>
+                <w:sz w:val="20"/>
+              </w:rPr>
+              <w:t>API key, username</w:t>
+            </w:r>
+          </w:p>
+        </w:tc>
+        <w:tc>
+          <w:tcPr>
+            <w:tcW w:type="dxa" w:w="2351"/>
+          </w:tcPr>
+          <w:p>
+            <w:r>
+              <w:rPr>
+                <w:rFonts w:ascii="Calibri" w:hAnsi="Calibri"/>
+                <w:color w:val="333333"/>
+                <w:sz w:val="20"/>
+              </w:rPr>
+              <w:t>🟡 Placeholder</w:t>
+            </w:r>
+          </w:p>
+        </w:tc>
+      </w:tr>
+      <w:tr>
+        <w:tc>
+          <w:tcPr>
+            <w:tcW w:type="dxa" w:w="2351"/>
+          </w:tcPr>
+          <w:p>
+            <w:r>
+              <w:rPr>
+                <w:rFonts w:ascii="Calibri" w:hAnsi="Calibri"/>
+                <w:color w:val="333333"/>
+                <w:sz w:val="20"/>
+              </w:rPr>
+              <w:t>**TrialOnline**</w:t>
+            </w:r>
+          </w:p>
+        </w:tc>
+        <w:tc>
+          <w:tcPr>
+            <w:tcW w:type="dxa" w:w="2351"/>
+          </w:tcPr>
+          <w:p>
+            <w:r>
+              <w:rPr>
+                <w:rFonts w:ascii="Calibri" w:hAnsi="Calibri"/>
+                <w:color w:val="333333"/>
+                <w:sz w:val="20"/>
+              </w:rPr>
+              <w:t>Commerciale</w:t>
+            </w:r>
+          </w:p>
+        </w:tc>
+        <w:tc>
+          <w:tcPr>
+            <w:tcW w:type="dxa" w:w="2351"/>
+          </w:tcPr>
+          <w:p>
+            <w:r>
+              <w:rPr>
+                <w:rFonts w:ascii="Calibri" w:hAnsi="Calibri"/>
+                <w:color w:val="333333"/>
+                <w:sz w:val="20"/>
+              </w:rPr>
+              <w:t>API key, username</w:t>
+            </w:r>
+          </w:p>
+        </w:tc>
+        <w:tc>
+          <w:tcPr>
+            <w:tcW w:type="dxa" w:w="2351"/>
+          </w:tcPr>
+          <w:p>
+            <w:r>
+              <w:rPr>
+                <w:rFonts w:ascii="Calibri" w:hAnsi="Calibri"/>
+                <w:color w:val="333333"/>
+                <w:sz w:val="20"/>
+              </w:rPr>
+              <w:t>🟡 Placeholder</w:t>
+            </w:r>
+          </w:p>
+        </w:tc>
+      </w:tr>
+      <w:tr>
+        <w:tc>
+          <w:tcPr>
+            <w:tcW w:type="dxa" w:w="2351"/>
+          </w:tcPr>
+          <w:p>
+            <w:r>
+              <w:rPr>
+                <w:rFonts w:ascii="Calibri" w:hAnsi="Calibri"/>
+                <w:color w:val="333333"/>
+                <w:sz w:val="20"/>
+              </w:rPr>
+              <w:t>**eDepart**</w:t>
+            </w:r>
+          </w:p>
+        </w:tc>
+        <w:tc>
+          <w:tcPr>
+            <w:tcW w:type="dxa" w:w="2351"/>
+          </w:tcPr>
+          <w:p>
+            <w:r>
+              <w:rPr>
+                <w:rFonts w:ascii="Calibri" w:hAnsi="Calibri"/>
+                <w:color w:val="333333"/>
+                <w:sz w:val="20"/>
+              </w:rPr>
+              <w:t>Commerciale</w:t>
+            </w:r>
+          </w:p>
+        </w:tc>
+        <w:tc>
+          <w:tcPr>
+            <w:tcW w:type="dxa" w:w="2351"/>
+          </w:tcPr>
+          <w:p>
+            <w:r>
+              <w:rPr>
+                <w:rFonts w:ascii="Calibri" w:hAnsi="Calibri"/>
+                <w:color w:val="333333"/>
+                <w:sz w:val="20"/>
+              </w:rPr>
+              <w:t>API key, username</w:t>
+            </w:r>
+          </w:p>
+        </w:tc>
+        <w:tc>
+          <w:tcPr>
+            <w:tcW w:type="dxa" w:w="2351"/>
+          </w:tcPr>
+          <w:p>
+            <w:r>
+              <w:rPr>
+                <w:rFonts w:ascii="Calibri" w:hAnsi="Calibri"/>
+                <w:color w:val="333333"/>
+                <w:sz w:val="20"/>
+              </w:rPr>
+              <w:t>🟡 Placeholder</w:t>
+            </w:r>
+          </w:p>
+        </w:tc>
+      </w:tr>
+      <w:tr>
+        <w:tc>
+          <w:tcPr>
+            <w:tcW w:type="dxa" w:w="2351"/>
+          </w:tcPr>
+          <w:p>
+            <w:r>
+              <w:rPr>
+                <w:rFonts w:ascii="Calibri" w:hAnsi="Calibri"/>
+                <w:color w:val="333333"/>
+                <w:sz w:val="20"/>
+              </w:rPr>
+              <w:t>**Altalex Studio Legale**</w:t>
+            </w:r>
+          </w:p>
+        </w:tc>
+        <w:tc>
+          <w:tcPr>
+            <w:tcW w:type="dxa" w:w="2351"/>
+          </w:tcPr>
+          <w:p>
+            <w:r>
+              <w:rPr>
+                <w:rFonts w:ascii="Calibri" w:hAnsi="Calibri"/>
+                <w:color w:val="333333"/>
+                <w:sz w:val="20"/>
+              </w:rPr>
+              <w:t>Commerciale</w:t>
+            </w:r>
+          </w:p>
+        </w:tc>
+        <w:tc>
+          <w:tcPr>
+            <w:tcW w:type="dxa" w:w="2351"/>
+          </w:tcPr>
+          <w:p>
+            <w:r>
+              <w:rPr>
+                <w:rFonts w:ascii="Calibri" w:hAnsi="Calibri"/>
+                <w:color w:val="333333"/>
+                <w:sz w:val="20"/>
+              </w:rPr>
+              <w:t>API key, client ID</w:t>
+            </w:r>
+          </w:p>
+        </w:tc>
+        <w:tc>
+          <w:tcPr>
+            <w:tcW w:type="dxa" w:w="2351"/>
+          </w:tcPr>
+          <w:p>
+            <w:r>
+              <w:rPr>
+                <w:rFonts w:ascii="Calibri" w:hAnsi="Calibri"/>
+                <w:color w:val="333333"/>
+                <w:sz w:val="20"/>
+              </w:rPr>
+              <w:t>🟡 Placeholder</w:t>
+            </w:r>
+          </w:p>
+        </w:tc>
+      </w:tr>
+    </w:tbl>
+    <w:p/>
+    <w:p>
+      <w:pPr>
+        <w:pStyle w:val="Heading3"/>
+        <w:spacing w:before="240" w:after="120"/>
+      </w:pPr>
+      <w:r>
+        <w:rPr>
+          <w:rFonts w:ascii="Calibri" w:hAnsi="Calibri"/>
+          <w:b/>
+          <w:color w:val="1A3C6E"/>
+          <w:sz w:val="26"/>
+        </w:rPr>
+        <w:t>Funzionalità</w:t>
+      </w:r>
+    </w:p>
+    <w:p>
+      <w:pPr>
+        <w:pStyle w:val="ListBullet"/>
+        <w:spacing w:line="360" w:lineRule="auto" w:after="80"/>
+        <w:ind w:left="567"/>
+      </w:pPr>
+      <w:r>
+        <w:rPr>
+          <w:rFonts w:ascii="Calibri" w:hAnsi="Calibri"/>
+          <w:color w:val="333333"/>
+          <w:sz w:val="22"/>
+        </w:rPr>
+        <w:t>Generazione pacchetto di deposito con metadati della pratica.</w:t>
+      </w:r>
+    </w:p>
+    <w:p>
+      <w:pPr>
+        <w:pStyle w:val="ListBullet"/>
+        <w:spacing w:line="360" w:lineRule="auto" w:after="80"/>
+        <w:ind w:left="567"/>
+      </w:pPr>
+      <w:r>
+        <w:rPr>
+          <w:rFonts w:ascii="Calibri" w:hAnsi="Calibri"/>
+          <w:color w:val="333333"/>
+          <w:sz w:val="22"/>
+        </w:rPr>
+        <w:t>Link rapido al portale corretto con dati precompilati quando possibile.</w:t>
+      </w:r>
+    </w:p>
+    <w:p>
+      <w:pPr>
+        <w:pStyle w:val="ListBullet"/>
+        <w:spacing w:line="360" w:lineRule="auto" w:after="80"/>
+        <w:ind w:left="567"/>
+      </w:pPr>
+      <w:r>
+        <w:rPr>
+          <w:rFonts w:ascii="Calibri" w:hAnsi="Calibri"/>
+          <w:color w:val="333333"/>
+          <w:sz w:val="22"/>
+        </w:rPr>
+        <w:t>Tracciamento manuale dello stato del deposito (bozza → pronto → depositato → esito).</w:t>
+      </w:r>
+    </w:p>
+    <w:p>
+      <w:pPr>
+        <w:pStyle w:val="ListBullet"/>
+        <w:spacing w:line="360" w:lineRule="auto" w:after="80"/>
+        <w:ind w:left="567"/>
+      </w:pPr>
+      <w:r>
+        <w:rPr>
+          <w:rFonts w:ascii="Calibri" w:hAnsi="Calibri"/>
+          <w:color w:val="333333"/>
+          <w:sz w:val="22"/>
+        </w:rPr>
+        <w:t>Template CSV per tenere traccia dei depositi in attesa di integrazione automatica.</w:t>
+      </w:r>
+    </w:p>
+    <w:p>
+      <w:pPr>
+        <w:pStyle w:val="Heading3"/>
+        <w:spacing w:before="240" w:after="120"/>
+      </w:pPr>
+      <w:r>
+        <w:rPr>
+          <w:rFonts w:ascii="Calibri" w:hAnsi="Calibri"/>
+          <w:b/>
+          <w:color w:val="1A3C6E"/>
+          <w:sz w:val="26"/>
+        </w:rPr>
+        <w:t>Come configurare un provider e-filing</w:t>
+      </w:r>
+    </w:p>
+    <w:p>
+      <w:pPr>
+        <w:pStyle w:val="ListNumber"/>
+        <w:spacing w:line="360" w:lineRule="auto" w:after="80"/>
+        <w:ind w:left="567"/>
+      </w:pPr>
+      <w:r>
+        <w:rPr>
+          <w:rFonts w:ascii="Calibri" w:hAnsi="Calibri"/>
+          <w:color w:val="333333"/>
+          <w:sz w:val="22"/>
+        </w:rPr>
+        <w:t>Vai su Impostazioni</w:t>
+      </w:r>
+    </w:p>
+    <w:p>
+      <w:pPr>
+        <w:pStyle w:val="ListNumber"/>
+        <w:spacing w:line="360" w:lineRule="auto" w:after="80"/>
+        <w:ind w:left="567"/>
+      </w:pPr>
+      <w:r>
+        <w:rPr>
+          <w:rFonts w:ascii="Calibri" w:hAnsi="Calibri"/>
+          <w:color w:val="333333"/>
+          <w:sz w:val="22"/>
+        </w:rPr>
+        <w:t>Scorri fino alla sezione ⚖️ Deposito Telematico / E-filing</w:t>
+      </w:r>
+    </w:p>
+    <w:p>
+      <w:pPr>
+        <w:pStyle w:val="ListNumber"/>
+        <w:spacing w:line="360" w:lineRule="auto" w:after="80"/>
+        <w:ind w:left="567"/>
+      </w:pPr>
+      <w:r>
+        <w:rPr>
+          <w:rFonts w:ascii="Calibri" w:hAnsi="Calibri"/>
+          <w:color w:val="333333"/>
+          <w:sz w:val="22"/>
+        </w:rPr>
+        <w:t>Espandi il provider che ti interessa</w:t>
+      </w:r>
+    </w:p>
+    <w:p>
+      <w:pPr>
+        <w:pStyle w:val="ListNumber"/>
+        <w:spacing w:line="360" w:lineRule="auto" w:after="80"/>
+        <w:ind w:left="567"/>
+      </w:pPr>
+      <w:r>
+        <w:rPr>
+          <w:rFonts w:ascii="Calibri" w:hAnsi="Calibri"/>
+          <w:color w:val="333333"/>
+          <w:sz w:val="22"/>
+        </w:rPr>
+        <w:t>Attiva il provider e inserisci i dati richiesti</w:t>
+      </w:r>
+    </w:p>
+    <w:p>
+      <w:pPr>
+        <w:pStyle w:val="ListNumber"/>
+        <w:spacing w:line="360" w:lineRule="auto" w:after="80"/>
+        <w:ind w:left="567"/>
+      </w:pPr>
+      <w:r>
+        <w:rPr>
+          <w:rFonts w:ascii="Calibri" w:hAnsi="Calibri"/>
+          <w:color w:val="333333"/>
+          <w:sz w:val="22"/>
+        </w:rPr>
+        <w:t>Clicca 💾 Salva</w:t>
+      </w:r>
+    </w:p>
+    <w:p>
+      <w:pPr>
+        <w:pStyle w:val="ListNumber"/>
+        <w:spacing w:line="360" w:lineRule="auto" w:after="80"/>
+        <w:ind w:left="567"/>
+      </w:pPr>
+      <w:r>
+        <w:rPr>
+          <w:rFonts w:ascii="Calibri" w:hAnsi="Calibri"/>
+          <w:color w:val="333333"/>
+          <w:sz w:val="22"/>
+        </w:rPr>
+        <w:t>Clicca 🧪 Test provider per verificare la configurazione</w:t>
+      </w:r>
+    </w:p>
+    <w:p>
+      <w:pPr>
+        <w:spacing w:before="120" w:after="120"/>
+        <w:ind w:left="567" w:right="567"/>
+      </w:pPr>
+      <w:r>
+        <w:rPr>
+          <w:rFonts w:ascii="Calibri" w:hAnsi="Calibri"/>
+          <w:i/>
+          <w:color w:val="555555"/>
+          <w:sz w:val="22"/>
+        </w:rPr>
+        <w:t>**Sicurezza:** le credenziali e i documenti relativi ai depositi telematici restano nello studio. La firma digitale viene richiesta all'esterno o tramite smart card locale; Studio Legale AI non gestisce chiavi private.</w:t>
       </w:r>
     </w:p>
     <w:p>

</xml_diff>

<commit_message>
Studio Legale AI manuale DOCX: release 2.4 (15 agosto 2026)
</commit_message>
<xml_diff>
--- a/STUDIO_LEGALE_AI_MANUALE_IT.docx
+++ b/STUDIO_LEGALE_AI_MANUALE_IT.docx
@@ -2,7 +2,57 @@
 <file path=word/document.xml><?xml version="1.0" encoding="utf-8"?>
 <w:document xmlns:w="http://schemas.openxmlformats.org/wordprocessingml/2006/main" xmlns:m="http://schemas.openxmlformats.org/officeDocument/2006/math" xmlns:r="http://schemas.openxmlformats.org/officeDocument/2006/relationships" xmlns:o="urn:schemas-microsoft-com:office:office" xmlns:v="urn:schemas-microsoft-com:vml" xmlns:w10="urn:schemas-microsoft-com:office:word" xmlns:a="http://schemas.openxmlformats.org/drawingml/2006/main" xmlns:pic="http://schemas.openxmlformats.org/drawingml/2006/picture" xmlns:wp="http://schemas.openxmlformats.org/drawingml/2006/wordprocessingDrawing">
   <w:body>
-    <w:bookmarkStart w:id="136" w:name="studio-legale-ai-manuale-utente"/>
+    <w:p>
+      <w:pPr>
+        <w:pStyle w:val="Title"/>
+      </w:pPr>
+      <w:r>
+        <w:t xml:space="preserve">Studio Legale AI — Manuale Utente</w:t>
+      </w:r>
+    </w:p>
+    <w:p>
+      <w:pPr>
+        <w:pStyle w:val="Subtitle"/>
+      </w:pPr>
+      <w:r>
+        <w:t xml:space="preserve">Versione 2.4 — 15 Agosto 2026</w:t>
+      </w:r>
+    </w:p>
+    <w:p>
+      <w:pPr>
+        <w:pStyle w:val="Author"/>
+      </w:pPr>
+      <w:r>
+        <w:t xml:space="preserve">GeneForge AI</w:t>
+      </w:r>
+    </w:p>
+    <w:sdt>
+      <w:sdtPr>
+        <w:docPartObj>
+          <w:docPartGallery w:val="Table of Contents"/>
+          <w:docPartUnique/>
+        </w:docPartObj>
+      </w:sdtPr>
+      <w:sdtContent>
+        <w:p>
+          <w:pPr>
+            <w:pStyle w:val="TOCHeading"/>
+          </w:pPr>
+          <w:r>
+            <w:t xml:space="preserve">Table of Contents</w:t>
+          </w:r>
+        </w:p>
+        <w:p>
+          <w:r>
+            <w:fldChar w:fldCharType="begin" w:dirty="true"/>
+            <w:instrText xml:space="preserve">TOC \o "1-2" \h \z \u</w:instrText>
+            <w:fldChar w:fldCharType="separate"/>
+            <w:fldChar w:fldCharType="end"/>
+          </w:r>
+        </w:p>
+      </w:sdtContent>
+    </w:sdt>
+    <w:bookmarkStart w:id="140" w:name="studio-legale-ai-manuale-utente"/>
     <w:p>
       <w:pPr>
         <w:pStyle w:val="Heading1"/>
@@ -26,7 +76,7 @@
         <w:t xml:space="preserve"> </w:t>
       </w:r>
       <w:r>
-        <w:t xml:space="preserve">2.3</w:t>
+        <w:t xml:space="preserve">2.4</w:t>
       </w:r>
       <w:r>
         <w:br/>
@@ -42,7 +92,7 @@
         <w:t xml:space="preserve"> </w:t>
       </w:r>
       <w:r>
-        <w:t xml:space="preserve">9 Luglio 2026</w:t>
+        <w:t xml:space="preserve">15 Agosto 2026</w:t>
       </w:r>
       <w:r>
         <w:br/>
@@ -7006,7 +7056,7 @@
               <w:jc w:val="left"/>
             </w:pPr>
             <w:r>
-              <w:t xml:space="preserve">Nemotron-70B</w:t>
+              <w:t xml:space="preserve">Nemotron 3.5 Lightning 30B</w:t>
             </w:r>
           </w:p>
         </w:tc>
@@ -7060,7 +7110,7 @@
               <w:jc w:val="left"/>
             </w:pPr>
             <w:r>
-              <w:t xml:space="preserve">Nemotron-70B</w:t>
+              <w:t xml:space="preserve">Nemotron 3.5 Lightning 30B</w:t>
             </w:r>
           </w:p>
         </w:tc>
@@ -15030,7 +15080,7 @@
         <w:t xml:space="preserve"> </w:t>
       </w:r>
       <w:r>
-        <w:t xml:space="preserve">Gli agenti AI girano sul tuo server locale. Nessun dato lascia il computer, eccetto le ricerche avanzate (Nemotron API) dove viene trasmesso</w:t>
+        <w:t xml:space="preserve">Tutti i modelli AI (Nemotron 3.5 Lightning 30B, Qwen2.5-7B, Qwen3-32B) girano sul tuo server locale via llama.cpp: nessun dato lascia il computer. Le uniche connessioni esterne sono le ricerche sui motori giuridici pubblici (Normattiva, EUR-Lex, ecc.), che trasmettono</w:t>
       </w:r>
       <w:r>
         <w:t xml:space="preserve"> </w:t>
@@ -15043,7 +15093,7 @@
         <w:t xml:space="preserve">solo il testo della query</w:t>
       </w:r>
       <w:r>
-        <w:t xml:space="preserve">, mai dati delle pratiche. Le ricerche sui motori giuridici (Normattiva, EUR-Lex, ecc.) sono pubbliche.</w:t>
+        <w:t xml:space="preserve">, mai dati delle pratiche.</w:t>
       </w:r>
     </w:p>
     <w:p>
@@ -16401,7 +16451,7 @@
         <w:t xml:space="preserve"> </w:t>
       </w:r>
       <w:r>
-        <w:t xml:space="preserve">Nemotron-70B</w:t>
+        <w:t xml:space="preserve">Nemotron 3.5 Lightning 30B</w:t>
       </w:r>
     </w:p>
     <w:p>
@@ -16573,7 +16623,7 @@
         <w:t xml:space="preserve"> </w:t>
       </w:r>
       <w:r>
-        <w:t xml:space="preserve">Nemotron-70B</w:t>
+        <w:t xml:space="preserve">Nemotron 3.5 Lightning 30B</w:t>
       </w:r>
     </w:p>
     <w:p>
@@ -16745,7 +16795,7 @@
         <w:t xml:space="preserve"> </w:t>
       </w:r>
       <w:r>
-        <w:t xml:space="preserve">Nemotron-70B</w:t>
+        <w:t xml:space="preserve">Nemotron 3.5 Lightning 30B</w:t>
       </w:r>
     </w:p>
     <w:p>
@@ -16929,7 +16979,7 @@
         <w:t xml:space="preserve"> </w:t>
       </w:r>
       <w:r>
-        <w:t xml:space="preserve">Nemotron-70B</w:t>
+        <w:t xml:space="preserve">Nemotron 3.5 Lightning 30B</w:t>
       </w:r>
     </w:p>
     <w:p>
@@ -17137,7 +17187,7 @@
         <w:t xml:space="preserve"> </w:t>
       </w:r>
       <w:r>
-        <w:t xml:space="preserve">Qwen-72B</w:t>
+        <w:t xml:space="preserve">Qwen2.5-7B</w:t>
       </w:r>
     </w:p>
     <w:p>
@@ -17319,7 +17369,7 @@
         <w:t xml:space="preserve"> </w:t>
       </w:r>
       <w:r>
-        <w:t xml:space="preserve">Nemotron-70B</w:t>
+        <w:t xml:space="preserve">Nemotron 3.5 Lightning 30B</w:t>
       </w:r>
     </w:p>
     <w:p>
@@ -17571,21 +17621,329 @@
     </w:p>
     <w:bookmarkEnd w:id="124"/>
     <w:bookmarkEnd w:id="125"/>
-    <w:bookmarkStart w:id="135" w:name="prezzi-e-servizi-commerciali"/>
+    <w:bookmarkStart w:id="129" w:name="consulenza-strategica-pagina-strategy"/>
     <w:p>
       <w:pPr>
         <w:pStyle w:val="Heading2"/>
       </w:pPr>
       <w:r>
-        <w:t xml:space="preserve">13. Prezzi e Servizi Commerciali</w:t>
-      </w:r>
-    </w:p>
-    <w:bookmarkStart w:id="126" w:name="modello-di-business"/>
+        <w:t xml:space="preserve">14. Consulenza Strategica (pagina /strategy)</w:t>
+      </w:r>
+    </w:p>
+    <w:p>
+      <w:pPr>
+        <w:pStyle w:val="FirstParagraph"/>
+      </w:pPr>
+      <w:r>
+        <w:t xml:space="preserve">La pagina</w:t>
+      </w:r>
+      <w:r>
+        <w:t xml:space="preserve"> </w:t>
+      </w:r>
+      <w:r>
+        <w:rPr>
+          <w:bCs/>
+          <w:b/>
+        </w:rPr>
+        <w:t xml:space="preserve">🧠 Strategia</w:t>
+      </w:r>
+      <w:r>
+        <w:t xml:space="preserve"> </w:t>
+      </w:r>
+      <w:r>
+        <w:t xml:space="preserve">è dedicata alle domande complesse: strategie difensive, valutazione di scenari, ottimizzazione delle soluzioni da prospettare ai clienti.</w:t>
+      </w:r>
+    </w:p>
+    <w:bookmarkStart w:id="126" w:name="come-funziona"/>
     <w:p>
       <w:pPr>
         <w:pStyle w:val="Heading3"/>
       </w:pPr>
       <w:r>
+        <w:t xml:space="preserve">Come funziona</w:t>
+      </w:r>
+    </w:p>
+    <w:p>
+      <w:pPr>
+        <w:numPr>
+          <w:ilvl w:val="0"/>
+          <w:numId w:val="1077"/>
+        </w:numPr>
+        <w:pStyle w:val="Compact"/>
+      </w:pPr>
+      <w:r>
+        <w:t xml:space="preserve">Usa un modello dedicato,</w:t>
+      </w:r>
+      <w:r>
+        <w:t xml:space="preserve"> </w:t>
+      </w:r>
+      <w:r>
+        <w:rPr>
+          <w:bCs/>
+          <w:b/>
+        </w:rPr>
+        <w:t xml:space="preserve">Qwen3-32B</w:t>
+      </w:r>
+      <w:r>
+        <w:t xml:space="preserve"> </w:t>
+      </w:r>
+      <w:r>
+        <w:t xml:space="preserve">(porta 8083), con</w:t>
+      </w:r>
+      <w:r>
+        <w:t xml:space="preserve"> </w:t>
+      </w:r>
+      <w:r>
+        <w:rPr>
+          <w:bCs/>
+          <w:b/>
+        </w:rPr>
+        <w:t xml:space="preserve">ragionamento visibile in diretta</w:t>
+      </w:r>
+      <w:r>
+        <w:t xml:space="preserve">: mentre il modello elabora, il pannello</w:t>
+      </w:r>
+      <w:r>
+        <w:t xml:space="preserve"> </w:t>
+      </w:r>
+      <w:r>
+        <w:t xml:space="preserve">“</w:t>
+      </w:r>
+      <w:r>
+        <w:t xml:space="preserve">Ragionamento del modello</w:t>
+      </w:r>
+      <w:r>
+        <w:t xml:space="preserve">”</w:t>
+      </w:r>
+      <w:r>
+        <w:t xml:space="preserve"> </w:t>
+      </w:r>
+      <w:r>
+        <w:t xml:space="preserve">mostra la catena logica passo-passo, poi si chiude automaticamente quando inizia la risposta finale.</w:t>
+      </w:r>
+    </w:p>
+    <w:p>
+      <w:pPr>
+        <w:numPr>
+          <w:ilvl w:val="0"/>
+          <w:numId w:val="1077"/>
+        </w:numPr>
+        <w:pStyle w:val="Compact"/>
+      </w:pPr>
+      <w:r>
+        <w:t xml:space="preserve">L’analisi può richiedere da 30 secondi ad alcuni minuti: il timer mostra il tempo trascorso e il pulsante</w:t>
+      </w:r>
+      <w:r>
+        <w:t xml:space="preserve"> </w:t>
+      </w:r>
+      <w:r>
+        <w:rPr>
+          <w:bCs/>
+          <w:b/>
+        </w:rPr>
+        <w:t xml:space="preserve">Interrompi</w:t>
+      </w:r>
+      <w:r>
+        <w:t xml:space="preserve"> </w:t>
+      </w:r>
+      <w:r>
+        <w:t xml:space="preserve">annulla l’elaborazione.</w:t>
+      </w:r>
+    </w:p>
+    <w:bookmarkEnd w:id="126"/>
+    <w:bookmarkStart w:id="127" w:name="due-modalità"/>
+    <w:p>
+      <w:pPr>
+        <w:pStyle w:val="Heading3"/>
+      </w:pPr>
+      <w:r>
+        <w:t xml:space="preserve">Due modalità</w:t>
+      </w:r>
+    </w:p>
+    <w:tbl>
+      <w:tblPr>
+        <w:tblStyle w:val="Table"/>
+        <w:tblW w:type="pct" w:w="5000"/>
+        <w:tblLook w:firstRow="1" w:lastRow="0" w:firstColumn="0" w:lastColumn="0" w:noHBand="0" w:noVBand="0" w:val="0020"/>
+        <w:jc w:val="start"/>
+      </w:tblPr>
+      <w:tblGrid>
+        <w:gridCol w:w="5280"/>
+        <w:gridCol w:w="2640"/>
+      </w:tblGrid>
+      <w:tr>
+        <w:trPr>
+          <w:tblHeader w:val="true"/>
+        </w:trPr>
+        <w:tc>
+          <w:tcPr/>
+          <w:p>
+            <w:pPr>
+              <w:pStyle w:val="Compact"/>
+              <w:jc w:val="left"/>
+            </w:pPr>
+            <w:r>
+              <w:t xml:space="preserve">Modalità</w:t>
+            </w:r>
+          </w:p>
+        </w:tc>
+        <w:tc>
+          <w:tcPr/>
+          <w:p>
+            <w:pPr>
+              <w:pStyle w:val="Compact"/>
+              <w:jc w:val="left"/>
+            </w:pPr>
+            <w:r>
+              <w:t xml:space="preserve">Uso</w:t>
+            </w:r>
+          </w:p>
+        </w:tc>
+      </w:tr>
+      <w:tr>
+        <w:tc>
+          <w:tcPr/>
+          <w:p>
+            <w:pPr>
+              <w:pStyle w:val="Compact"/>
+              <w:jc w:val="left"/>
+            </w:pPr>
+            <w:r>
+              <w:rPr>
+                <w:bCs/>
+                <w:b/>
+              </w:rPr>
+              <w:t xml:space="preserve">Consulenza strategica</w:t>
+            </w:r>
+          </w:p>
+        </w:tc>
+        <w:tc>
+          <w:tcPr/>
+          <w:p>
+            <w:pPr>
+              <w:pStyle w:val="Compact"/>
+              <w:jc w:val="left"/>
+            </w:pPr>
+            <w:r>
+              <w:t xml:space="preserve">Scenari, rischi, tempistiche, raccomandazione finale attuabile</w:t>
+            </w:r>
+          </w:p>
+        </w:tc>
+      </w:tr>
+      <w:tr>
+        <w:tc>
+          <w:tcPr/>
+          <w:p>
+            <w:pPr>
+              <w:pStyle w:val="Compact"/>
+              <w:jc w:val="left"/>
+            </w:pPr>
+            <w:r>
+              <w:rPr>
+                <w:bCs/>
+                <w:b/>
+              </w:rPr>
+              <w:t xml:space="preserve">Modalità contenzioso</w:t>
+            </w:r>
+          </w:p>
+        </w:tc>
+        <w:tc>
+          <w:tcPr/>
+          <w:p>
+            <w:pPr>
+              <w:pStyle w:val="Compact"/>
+              <w:jc w:val="left"/>
+            </w:pPr>
+            <w:r>
+              <w:t xml:space="preserve">Analisi forense a 8 punti per cause contro attori istituzionali/industriali: catena della conoscenza, onere probatorio, conflitti di interesse di periti e CTU, dati grezzi da richiedere, timeline delle riammissioni</w:t>
+            </w:r>
+          </w:p>
+        </w:tc>
+      </w:tr>
+    </w:tbl>
+    <w:bookmarkEnd w:id="127"/>
+    <w:bookmarkStart w:id="128" w:name="note-duso"/>
+    <w:p>
+      <w:pPr>
+        <w:pStyle w:val="Heading3"/>
+      </w:pPr>
+      <w:r>
+        <w:t xml:space="preserve">Note d’uso</w:t>
+      </w:r>
+    </w:p>
+    <w:p>
+      <w:pPr>
+        <w:numPr>
+          <w:ilvl w:val="0"/>
+          <w:numId w:val="1078"/>
+        </w:numPr>
+        <w:pStyle w:val="Compact"/>
+      </w:pPr>
+      <w:r>
+        <w:t xml:space="preserve">La risposta è sempre nella lingua della domanda (italiano o bulgaro); il ragionamento interno può apparire in inglese — è normale.</w:t>
+      </w:r>
+    </w:p>
+    <w:p>
+      <w:pPr>
+        <w:numPr>
+          <w:ilvl w:val="0"/>
+          <w:numId w:val="1078"/>
+        </w:numPr>
+        <w:pStyle w:val="Compact"/>
+      </w:pPr>
+      <w:r>
+        <w:t xml:space="preserve">La Modalità contenzioso lavora</w:t>
+      </w:r>
+      <w:r>
+        <w:t xml:space="preserve"> </w:t>
+      </w:r>
+      <w:r>
+        <w:rPr>
+          <w:bCs/>
+          <w:b/>
+        </w:rPr>
+        <w:t xml:space="preserve">solo sui fatti e sugli atti forniti</w:t>
+      </w:r>
+      <w:r>
+        <w:t xml:space="preserve">: elenca cosa procurarsi e dove cercarlo, senza pronunciarsi sul merito scientifico.</w:t>
+      </w:r>
+    </w:p>
+    <w:p>
+      <w:pPr>
+        <w:numPr>
+          <w:ilvl w:val="0"/>
+          <w:numId w:val="1078"/>
+        </w:numPr>
+        <w:pStyle w:val="Compact"/>
+      </w:pPr>
+      <w:r>
+        <w:t xml:space="preserve">Il ragionamento mostrato è uno strumento di trasparenza interna: non va copiato negli atti.</w:t>
+      </w:r>
+    </w:p>
+    <w:p>
+      <w:r>
+        <w:pict>
+          <v:rect style="width:0;height:1.5pt" o:hralign="center" o:hrstd="t" o:hr="t"/>
+        </w:pict>
+      </w:r>
+    </w:p>
+    <w:bookmarkEnd w:id="128"/>
+    <w:bookmarkEnd w:id="129"/>
+    <w:bookmarkStart w:id="139" w:name="prezzi-e-servizi-commerciali"/>
+    <w:p>
+      <w:pPr>
+        <w:pStyle w:val="Heading2"/>
+      </w:pPr>
+      <w:r>
+        <w:t xml:space="preserve">15. Prezzi e Servizi Commerciali</w:t>
+      </w:r>
+    </w:p>
+    <w:bookmarkStart w:id="130" w:name="modello-di-business"/>
+    <w:p>
+      <w:pPr>
+        <w:pStyle w:val="Heading3"/>
+      </w:pPr>
+      <w:r>
         <w:t xml:space="preserve">Modello di business</w:t>
       </w:r>
     </w:p>
@@ -17610,8 +17968,8 @@
         <w:t xml:space="preserve">: il sistema viene installato fisicamente nello studio su hardware NVIDIA DGX SPARK (acquistato separatamente). I dati non escono mai dall’ufficio.</w:t>
       </w:r>
     </w:p>
-    <w:bookmarkEnd w:id="126"/>
-    <w:bookmarkStart w:id="127" w:name="pacchetti-disponibili"/>
+    <w:bookmarkEnd w:id="130"/>
+    <w:bookmarkStart w:id="131" w:name="pacchetti-disponibili"/>
     <w:p>
       <w:pPr>
         <w:pStyle w:val="Heading3"/>
@@ -17849,8 +18207,8 @@
         </w:tc>
       </w:tr>
     </w:tbl>
-    <w:bookmarkEnd w:id="127"/>
-    <w:bookmarkStart w:id="131" w:name="cosa-include-ogni-pacchetto"/>
+    <w:bookmarkEnd w:id="131"/>
+    <w:bookmarkStart w:id="135" w:name="cosa-include-ogni-pacchetto"/>
     <w:p>
       <w:pPr>
         <w:pStyle w:val="Heading3"/>
@@ -17859,7 +18217,7 @@
         <w:t xml:space="preserve">Cosa include ogni pacchetto</w:t>
       </w:r>
     </w:p>
-    <w:bookmarkStart w:id="128" w:name="base-500mese"/>
+    <w:bookmarkStart w:id="132" w:name="base-500mese"/>
     <w:p>
       <w:pPr>
         <w:pStyle w:val="Heading4"/>
@@ -17872,7 +18230,7 @@
       <w:pPr>
         <w:numPr>
           <w:ilvl w:val="0"/>
-          <w:numId w:val="1077"/>
+          <w:numId w:val="1079"/>
         </w:numPr>
         <w:pStyle w:val="Compact"/>
       </w:pPr>
@@ -17884,7 +18242,7 @@
       <w:pPr>
         <w:numPr>
           <w:ilvl w:val="0"/>
-          <w:numId w:val="1077"/>
+          <w:numId w:val="1079"/>
         </w:numPr>
         <w:pStyle w:val="Compact"/>
       </w:pPr>
@@ -17896,7 +18254,7 @@
       <w:pPr>
         <w:numPr>
           <w:ilvl w:val="0"/>
-          <w:numId w:val="1077"/>
+          <w:numId w:val="1079"/>
         </w:numPr>
         <w:pStyle w:val="Compact"/>
       </w:pPr>
@@ -17908,7 +18266,7 @@
       <w:pPr>
         <w:numPr>
           <w:ilvl w:val="0"/>
-          <w:numId w:val="1077"/>
+          <w:numId w:val="1079"/>
         </w:numPr>
         <w:pStyle w:val="Compact"/>
       </w:pPr>
@@ -17920,7 +18278,7 @@
       <w:pPr>
         <w:numPr>
           <w:ilvl w:val="0"/>
-          <w:numId w:val="1077"/>
+          <w:numId w:val="1079"/>
         </w:numPr>
         <w:pStyle w:val="Compact"/>
       </w:pPr>
@@ -17928,8 +18286,8 @@
         <w:t xml:space="preserve">Supporto email (24h SLA)</w:t>
       </w:r>
     </w:p>
-    <w:bookmarkEnd w:id="128"/>
-    <w:bookmarkStart w:id="129" w:name="professional-1.000mese"/>
+    <w:bookmarkEnd w:id="132"/>
+    <w:bookmarkStart w:id="133" w:name="professional-1.000mese"/>
     <w:p>
       <w:pPr>
         <w:pStyle w:val="Heading4"/>
@@ -17942,7 +18300,7 @@
       <w:pPr>
         <w:numPr>
           <w:ilvl w:val="0"/>
-          <w:numId w:val="1078"/>
+          <w:numId w:val="1080"/>
         </w:numPr>
         <w:pStyle w:val="Compact"/>
       </w:pPr>
@@ -17954,7 +18312,7 @@
       <w:pPr>
         <w:numPr>
           <w:ilvl w:val="0"/>
-          <w:numId w:val="1078"/>
+          <w:numId w:val="1080"/>
         </w:numPr>
         <w:pStyle w:val="Compact"/>
       </w:pPr>
@@ -17966,7 +18324,7 @@
       <w:pPr>
         <w:numPr>
           <w:ilvl w:val="0"/>
-          <w:numId w:val="1078"/>
+          <w:numId w:val="1080"/>
         </w:numPr>
         <w:pStyle w:val="Compact"/>
       </w:pPr>
@@ -17978,7 +18336,7 @@
       <w:pPr>
         <w:numPr>
           <w:ilvl w:val="0"/>
-          <w:numId w:val="1078"/>
+          <w:numId w:val="1080"/>
         </w:numPr>
         <w:pStyle w:val="Compact"/>
       </w:pPr>
@@ -17990,7 +18348,7 @@
       <w:pPr>
         <w:numPr>
           <w:ilvl w:val="0"/>
-          <w:numId w:val="1078"/>
+          <w:numId w:val="1080"/>
         </w:numPr>
         <w:pStyle w:val="Compact"/>
       </w:pPr>
@@ -18002,7 +18360,7 @@
       <w:pPr>
         <w:numPr>
           <w:ilvl w:val="0"/>
-          <w:numId w:val="1078"/>
+          <w:numId w:val="1080"/>
         </w:numPr>
         <w:pStyle w:val="Compact"/>
       </w:pPr>
@@ -18010,8 +18368,8 @@
         <w:t xml:space="preserve">2 sessioni di formazione</w:t>
       </w:r>
     </w:p>
-    <w:bookmarkEnd w:id="129"/>
-    <w:bookmarkStart w:id="130" w:name="enterprise-2.500mese"/>
+    <w:bookmarkEnd w:id="133"/>
+    <w:bookmarkStart w:id="134" w:name="enterprise-2.500mese"/>
     <w:p>
       <w:pPr>
         <w:pStyle w:val="Heading4"/>
@@ -18024,7 +18382,7 @@
       <w:pPr>
         <w:numPr>
           <w:ilvl w:val="0"/>
-          <w:numId w:val="1079"/>
+          <w:numId w:val="1081"/>
         </w:numPr>
         <w:pStyle w:val="Compact"/>
       </w:pPr>
@@ -18036,7 +18394,7 @@
       <w:pPr>
         <w:numPr>
           <w:ilvl w:val="0"/>
-          <w:numId w:val="1079"/>
+          <w:numId w:val="1081"/>
         </w:numPr>
         <w:pStyle w:val="Compact"/>
       </w:pPr>
@@ -18048,7 +18406,7 @@
       <w:pPr>
         <w:numPr>
           <w:ilvl w:val="0"/>
-          <w:numId w:val="1079"/>
+          <w:numId w:val="1081"/>
         </w:numPr>
         <w:pStyle w:val="Compact"/>
       </w:pPr>
@@ -18060,7 +18418,7 @@
       <w:pPr>
         <w:numPr>
           <w:ilvl w:val="0"/>
-          <w:numId w:val="1079"/>
+          <w:numId w:val="1081"/>
         </w:numPr>
         <w:pStyle w:val="Compact"/>
       </w:pPr>
@@ -18072,7 +18430,7 @@
       <w:pPr>
         <w:numPr>
           <w:ilvl w:val="0"/>
-          <w:numId w:val="1079"/>
+          <w:numId w:val="1081"/>
         </w:numPr>
         <w:pStyle w:val="Compact"/>
       </w:pPr>
@@ -18084,7 +18442,7 @@
       <w:pPr>
         <w:numPr>
           <w:ilvl w:val="0"/>
-          <w:numId w:val="1079"/>
+          <w:numId w:val="1081"/>
         </w:numPr>
         <w:pStyle w:val="Compact"/>
       </w:pPr>
@@ -18092,9 +18450,9 @@
         <w:t xml:space="preserve">Cluster HA (2 DGX SPARK)</w:t>
       </w:r>
     </w:p>
-    <w:bookmarkEnd w:id="130"/>
-    <w:bookmarkEnd w:id="131"/>
-    <w:bookmarkStart w:id="132" w:name="hardware-prerequisito"/>
+    <w:bookmarkEnd w:id="134"/>
+    <w:bookmarkEnd w:id="135"/>
+    <w:bookmarkStart w:id="136" w:name="hardware-prerequisito"/>
     <w:p>
       <w:pPr>
         <w:pStyle w:val="Heading3"/>
@@ -18135,8 +18493,8 @@
         <w:t xml:space="preserve">- &lt; 35 dB in operazione (adatto a ufficio)</w:t>
       </w:r>
     </w:p>
-    <w:bookmarkEnd w:id="132"/>
-    <w:bookmarkStart w:id="133" w:name="roi-stimato"/>
+    <w:bookmarkEnd w:id="136"/>
+    <w:bookmarkStart w:id="137" w:name="roi-stimato"/>
     <w:p>
       <w:pPr>
         <w:pStyle w:val="Heading3"/>
@@ -18304,8 +18662,8 @@
         </w:tc>
       </w:tr>
     </w:tbl>
-    <w:bookmarkEnd w:id="133"/>
-    <w:bookmarkStart w:id="134" w:name="contatti-commerciali"/>
+    <w:bookmarkEnd w:id="137"/>
+    <w:bookmarkStart w:id="138" w:name="contatti-commerciali"/>
     <w:p>
       <w:pPr>
         <w:pStyle w:val="Heading3"/>
@@ -18318,7 +18676,7 @@
       <w:pPr>
         <w:numPr>
           <w:ilvl w:val="0"/>
-          <w:numId w:val="1080"/>
+          <w:numId w:val="1082"/>
         </w:numPr>
         <w:pStyle w:val="Compact"/>
       </w:pPr>
@@ -18340,7 +18698,7 @@
       <w:pPr>
         <w:numPr>
           <w:ilvl w:val="0"/>
-          <w:numId w:val="1080"/>
+          <w:numId w:val="1082"/>
         </w:numPr>
         <w:pStyle w:val="Compact"/>
       </w:pPr>
@@ -18362,7 +18720,7 @@
       <w:pPr>
         <w:numPr>
           <w:ilvl w:val="0"/>
-          <w:numId w:val="1080"/>
+          <w:numId w:val="1082"/>
         </w:numPr>
         <w:pStyle w:val="Compact"/>
       </w:pPr>
@@ -18430,12 +18788,12 @@
           <w:iCs/>
           <w:i/>
         </w:rPr>
-        <w:t xml:space="preserve">Versione 2.1 — 2 Maggio 2026</w:t>
-      </w:r>
-    </w:p>
-    <w:bookmarkEnd w:id="134"/>
-    <w:bookmarkEnd w:id="135"/>
-    <w:bookmarkEnd w:id="136"/>
+        <w:t xml:space="preserve">Versione 2.4 — 15 Agosto 2026</w:t>
+      </w:r>
+    </w:p>
+    <w:bookmarkEnd w:id="138"/>
+    <w:bookmarkEnd w:id="139"/>
+    <w:bookmarkEnd w:id="140"/>
     <w:sectPr/>
   </w:body>
 </w:document>
@@ -20055,6 +20413,12 @@
     <w:abstractNumId w:val="991"/>
   </w:num>
   <w:num w:numId="1080">
+    <w:abstractNumId w:val="991"/>
+  </w:num>
+  <w:num w:numId="1081">
+    <w:abstractNumId w:val="991"/>
+  </w:num>
+  <w:num w:numId="1082">
     <w:abstractNumId w:val="991"/>
   </w:num>
 </w:numbering>
@@ -20546,7 +20910,7 @@
       <w:color w:themeColor="accent1" w:themeShade="BF" w:val="365F91"/>
     </w:rPr>
   </w:style>
-  <w:style w:type="paragraph" w:customStyle="1" w:styleId="SourceCode">
+  <w:style w:customStyle="1" w:styleId="SourceCode" w:type="paragraph">
     <w:name w:val="Source Code"/>
     <w:basedOn w:val="Normal"/>
     <w:link w:val="VerbatimChar"/>
@@ -20554,7 +20918,7 @@
       <w:wordWrap w:val="off"/>
     </w:pPr>
   </w:style>
-  <w:style w:type="character" w:customStyle="1" w:styleId="KeywordTok">
+  <w:style w:customStyle="1" w:styleId="KeywordTok" w:type="character">
     <w:name w:val="KeywordTok"/>
     <w:basedOn w:val="VerbatimChar"/>
     <w:rPr>
@@ -20562,77 +20926,77 @@
       <w:b/>
     </w:rPr>
   </w:style>
-  <w:style w:type="character" w:customStyle="1" w:styleId="DataTypeTok">
+  <w:style w:customStyle="1" w:styleId="DataTypeTok" w:type="character">
     <w:name w:val="DataTypeTok"/>
     <w:basedOn w:val="VerbatimChar"/>
     <w:rPr>
       <w:color w:val="902000"/>
     </w:rPr>
   </w:style>
-  <w:style w:type="character" w:customStyle="1" w:styleId="DecValTok">
+  <w:style w:customStyle="1" w:styleId="DecValTok" w:type="character">
     <w:name w:val="DecValTok"/>
     <w:basedOn w:val="VerbatimChar"/>
     <w:rPr>
       <w:color w:val="40a070"/>
     </w:rPr>
   </w:style>
-  <w:style w:type="character" w:customStyle="1" w:styleId="BaseNTok">
+  <w:style w:customStyle="1" w:styleId="BaseNTok" w:type="character">
     <w:name w:val="BaseNTok"/>
     <w:basedOn w:val="VerbatimChar"/>
     <w:rPr>
       <w:color w:val="40a070"/>
     </w:rPr>
   </w:style>
-  <w:style w:type="character" w:customStyle="1" w:styleId="FloatTok">
+  <w:style w:customStyle="1" w:styleId="FloatTok" w:type="character">
     <w:name w:val="FloatTok"/>
     <w:basedOn w:val="VerbatimChar"/>
     <w:rPr>
       <w:color w:val="40a070"/>
     </w:rPr>
   </w:style>
-  <w:style w:type="character" w:customStyle="1" w:styleId="ConstantTok">
+  <w:style w:customStyle="1" w:styleId="ConstantTok" w:type="character">
     <w:name w:val="ConstantTok"/>
     <w:basedOn w:val="VerbatimChar"/>
     <w:rPr>
       <w:color w:val="880000"/>
     </w:rPr>
   </w:style>
-  <w:style w:type="character" w:customStyle="1" w:styleId="CharTok">
+  <w:style w:customStyle="1" w:styleId="CharTok" w:type="character">
     <w:name w:val="CharTok"/>
     <w:basedOn w:val="VerbatimChar"/>
     <w:rPr>
       <w:color w:val="4070a0"/>
     </w:rPr>
   </w:style>
-  <w:style w:type="character" w:customStyle="1" w:styleId="SpecialCharTok">
+  <w:style w:customStyle="1" w:styleId="SpecialCharTok" w:type="character">
     <w:name w:val="SpecialCharTok"/>
     <w:basedOn w:val="VerbatimChar"/>
     <w:rPr>
       <w:color w:val="4070a0"/>
     </w:rPr>
   </w:style>
-  <w:style w:type="character" w:customStyle="1" w:styleId="StringTok">
+  <w:style w:customStyle="1" w:styleId="StringTok" w:type="character">
     <w:name w:val="StringTok"/>
     <w:basedOn w:val="VerbatimChar"/>
     <w:rPr>
       <w:color w:val="4070a0"/>
     </w:rPr>
   </w:style>
-  <w:style w:type="character" w:customStyle="1" w:styleId="VerbatimStringTok">
+  <w:style w:customStyle="1" w:styleId="VerbatimStringTok" w:type="character">
     <w:name w:val="VerbatimStringTok"/>
     <w:basedOn w:val="VerbatimChar"/>
     <w:rPr>
       <w:color w:val="4070a0"/>
     </w:rPr>
   </w:style>
-  <w:style w:type="character" w:customStyle="1" w:styleId="SpecialStringTok">
+  <w:style w:customStyle="1" w:styleId="SpecialStringTok" w:type="character">
     <w:name w:val="SpecialStringTok"/>
     <w:basedOn w:val="VerbatimChar"/>
     <w:rPr>
       <w:color w:val="bb6688"/>
     </w:rPr>
   </w:style>
-  <w:style w:type="character" w:customStyle="1" w:styleId="ImportTok">
+  <w:style w:customStyle="1" w:styleId="ImportTok" w:type="character">
     <w:name w:val="ImportTok"/>
     <w:basedOn w:val="VerbatimChar"/>
     <w:rPr>
@@ -20640,7 +21004,7 @@
       <w:b/>
     </w:rPr>
   </w:style>
-  <w:style w:type="character" w:customStyle="1" w:styleId="CommentTok">
+  <w:style w:customStyle="1" w:styleId="CommentTok" w:type="character">
     <w:name w:val="CommentTok"/>
     <w:basedOn w:val="VerbatimChar"/>
     <w:rPr>
@@ -20648,7 +21012,7 @@
       <w:i/>
     </w:rPr>
   </w:style>
-  <w:style w:type="character" w:customStyle="1" w:styleId="DocumentationTok">
+  <w:style w:customStyle="1" w:styleId="DocumentationTok" w:type="character">
     <w:name w:val="DocumentationTok"/>
     <w:basedOn w:val="VerbatimChar"/>
     <w:rPr>
@@ -20656,7 +21020,7 @@
       <w:i/>
     </w:rPr>
   </w:style>
-  <w:style w:type="character" w:customStyle="1" w:styleId="AnnotationTok">
+  <w:style w:customStyle="1" w:styleId="AnnotationTok" w:type="character">
     <w:name w:val="AnnotationTok"/>
     <w:basedOn w:val="VerbatimChar"/>
     <w:rPr>
@@ -20665,7 +21029,7 @@
       <w:i/>
     </w:rPr>
   </w:style>
-  <w:style w:type="character" w:customStyle="1" w:styleId="CommentVarTok">
+  <w:style w:customStyle="1" w:styleId="CommentVarTok" w:type="character">
     <w:name w:val="CommentVarTok"/>
     <w:basedOn w:val="VerbatimChar"/>
     <w:rPr>
@@ -20674,28 +21038,28 @@
       <w:i/>
     </w:rPr>
   </w:style>
-  <w:style w:type="character" w:customStyle="1" w:styleId="OtherTok">
+  <w:style w:customStyle="1" w:styleId="OtherTok" w:type="character">
     <w:name w:val="OtherTok"/>
     <w:basedOn w:val="VerbatimChar"/>
     <w:rPr>
       <w:color w:val="007020"/>
     </w:rPr>
   </w:style>
-  <w:style w:type="character" w:customStyle="1" w:styleId="FunctionTok">
+  <w:style w:customStyle="1" w:styleId="FunctionTok" w:type="character">
     <w:name w:val="FunctionTok"/>
     <w:basedOn w:val="VerbatimChar"/>
     <w:rPr>
       <w:color w:val="06287e"/>
     </w:rPr>
   </w:style>
-  <w:style w:type="character" w:customStyle="1" w:styleId="VariableTok">
+  <w:style w:customStyle="1" w:styleId="VariableTok" w:type="character">
     <w:name w:val="VariableTok"/>
     <w:basedOn w:val="VerbatimChar"/>
     <w:rPr>
       <w:color w:val="19177c"/>
     </w:rPr>
   </w:style>
-  <w:style w:type="character" w:customStyle="1" w:styleId="ControlFlowTok">
+  <w:style w:customStyle="1" w:styleId="ControlFlowTok" w:type="character">
     <w:name w:val="ControlFlowTok"/>
     <w:basedOn w:val="VerbatimChar"/>
     <w:rPr>
@@ -20703,45 +21067,45 @@
       <w:b/>
     </w:rPr>
   </w:style>
-  <w:style w:type="character" w:customStyle="1" w:styleId="OperatorTok">
+  <w:style w:customStyle="1" w:styleId="OperatorTok" w:type="character">
     <w:name w:val="OperatorTok"/>
     <w:basedOn w:val="VerbatimChar"/>
     <w:rPr>
       <w:color w:val="666666"/>
     </w:rPr>
   </w:style>
-  <w:style w:type="character" w:customStyle="1" w:styleId="BuiltInTok">
+  <w:style w:customStyle="1" w:styleId="BuiltInTok" w:type="character">
     <w:name w:val="BuiltInTok"/>
     <w:basedOn w:val="VerbatimChar"/>
     <w:rPr>
       <w:color w:val="008000"/>
     </w:rPr>
   </w:style>
-  <w:style w:type="character" w:customStyle="1" w:styleId="ExtensionTok">
+  <w:style w:customStyle="1" w:styleId="ExtensionTok" w:type="character">
     <w:name w:val="ExtensionTok"/>
     <w:basedOn w:val="VerbatimChar"/>
     <w:rPr/>
   </w:style>
-  <w:style w:type="character" w:customStyle="1" w:styleId="PreprocessorTok">
+  <w:style w:customStyle="1" w:styleId="PreprocessorTok" w:type="character">
     <w:name w:val="PreprocessorTok"/>
     <w:basedOn w:val="VerbatimChar"/>
     <w:rPr>
       <w:color w:val="bc7a00"/>
     </w:rPr>
   </w:style>
-  <w:style w:type="character" w:customStyle="1" w:styleId="AttributeTok">
+  <w:style w:customStyle="1" w:styleId="AttributeTok" w:type="character">
     <w:name w:val="AttributeTok"/>
     <w:basedOn w:val="VerbatimChar"/>
     <w:rPr>
       <w:color w:val="7d9029"/>
     </w:rPr>
   </w:style>
-  <w:style w:type="character" w:customStyle="1" w:styleId="RegionMarkerTok">
+  <w:style w:customStyle="1" w:styleId="RegionMarkerTok" w:type="character">
     <w:name w:val="RegionMarkerTok"/>
     <w:basedOn w:val="VerbatimChar"/>
     <w:rPr/>
   </w:style>
-  <w:style w:type="character" w:customStyle="1" w:styleId="InformationTok">
+  <w:style w:customStyle="1" w:styleId="InformationTok" w:type="character">
     <w:name w:val="InformationTok"/>
     <w:basedOn w:val="VerbatimChar"/>
     <w:rPr>
@@ -20750,7 +21114,7 @@
       <w:i/>
     </w:rPr>
   </w:style>
-  <w:style w:type="character" w:customStyle="1" w:styleId="WarningTok">
+  <w:style w:customStyle="1" w:styleId="WarningTok" w:type="character">
     <w:name w:val="WarningTok"/>
     <w:basedOn w:val="VerbatimChar"/>
     <w:rPr>
@@ -20759,7 +21123,7 @@
       <w:i/>
     </w:rPr>
   </w:style>
-  <w:style w:type="character" w:customStyle="1" w:styleId="AlertTok">
+  <w:style w:customStyle="1" w:styleId="AlertTok" w:type="character">
     <w:name w:val="AlertTok"/>
     <w:basedOn w:val="VerbatimChar"/>
     <w:rPr>
@@ -20767,7 +21131,7 @@
       <w:b/>
     </w:rPr>
   </w:style>
-  <w:style w:type="character" w:customStyle="1" w:styleId="ErrorTok">
+  <w:style w:customStyle="1" w:styleId="ErrorTok" w:type="character">
     <w:name w:val="ErrorTok"/>
     <w:basedOn w:val="VerbatimChar"/>
     <w:rPr>
@@ -20775,7 +21139,7 @@
       <w:b/>
     </w:rPr>
   </w:style>
-  <w:style w:type="character" w:customStyle="1" w:styleId="NormalTok">
+  <w:style w:customStyle="1" w:styleId="NormalTok" w:type="character">
     <w:name w:val="NormalTok"/>
     <w:basedOn w:val="VerbatimChar"/>
     <w:rPr/>

</xml_diff>